<commit_message>
feat: Unit 3 lessons 3 and 4 for Grade 3 and Grade 4 (with team games) and four-lesson plans
Grade 3: Money Changes (Time Train game, vote) and Design the Next Money (Problem and
Solution Pairs, Money Machine). Grade 4: The Ice Cracks (Cause and Effect Pairs, help vote)
and Explore the Poem (Stanza Detective, -ng sound, perform the poem). Library, timetable,
Today list and lesson plans (Word + PDF) updated.

Co-Authored-By: Claude Sonnet 5.5 <noreply@anthropic.com>
</commit_message>
<xml_diff>
--- a/lesson-plans/Grade3-Unit3-Lesson-Plans.docx
+++ b/lesson-plans/Grade3-Unit3-Lesson-Plans.docx
@@ -3761,6 +3761,3431 @@
       </w:r>
       <w:r>
         <w:t xml:space="preserve">Door pass: "People used … as money." (shells / coins / goats …). Give a team point for every correct team, not only the fastest.</w:t>
+      </w:r>
+    </w:p>
+    <w:p>
+      <w:pPr>
+        <w:pStyle w:val="Heading1"/>
+        <w:pageBreakBefore/>
+      </w:pPr>
+      <w:r>
+        <w:t xml:space="preserve">Grade 3 · Unit 3 · How Much Is It? · Lesson 3: Money Changes</w:t>
+      </w:r>
+    </w:p>
+    <w:p>
+      <w:pPr>
+        <w:spacing w:after="100"/>
+      </w:pPr>
+      <w:r>
+        <w:rPr>
+          <w:color w:val="475569"/>
+          <w:sz w:val="20"/>
+          <w:szCs w:val="20"/>
+        </w:rPr>
+        <w:t xml:space="preserve">35 minutes · classes 3A and 3B · A1 · one smartboard + mini whiteboards · Open: unit3-g3-lessons/index.html?lesson=3</w:t>
+      </w:r>
+    </w:p>
+    <w:p>
+      <w:pPr>
+        <w:spacing w:after="60"/>
+      </w:pPr>
+      <w:r>
+        <w:rPr>
+          <w:b/>
+          <w:bCs/>
+        </w:rPr>
+        <w:t xml:space="preserve">Lesson goal. </w:t>
+      </w:r>
+      <w:r>
+        <w:t xml:space="preserve">Pupils say how money changed (coins, paper money, credit cards, electronic money), use "easier to carry than", learn six money words and say what they think the next money will be.</w:t>
+      </w:r>
+    </w:p>
+    <w:p>
+      <w:pPr>
+        <w:spacing w:after="60"/>
+      </w:pPr>
+      <w:r>
+        <w:rPr>
+          <w:b/>
+          <w:bCs/>
+        </w:rPr>
+        <w:t xml:space="preserve">Book link. </w:t>
+      </w:r>
+      <w:r>
+        <w:t xml:space="preserve">Book pp. 44-45 (Reading 1 continued: coins, paper money, credit card, electronic money; the timeline).</w:t>
+      </w:r>
+    </w:p>
+    <w:p>
+      <w:pPr>
+        <w:spacing w:after="60"/>
+      </w:pPr>
+      <w:r>
+        <w:rPr>
+          <w:b/>
+          <w:bCs/>
+        </w:rPr>
+        <w:t xml:space="preserve">Words. </w:t>
+      </w:r>
+      <w:r>
+        <w:t xml:space="preserve">coin, paper money, credit card, electronic money, internet, century</w:t>
+      </w:r>
+    </w:p>
+    <w:p>
+      <w:pPr>
+        <w:spacing w:after="60"/>
+      </w:pPr>
+      <w:r>
+        <w:rPr>
+          <w:b/>
+          <w:bCs/>
+        </w:rPr>
+        <w:t xml:space="preserve">Language. </w:t>
+      </w:r>
+      <w:r>
+        <w:t xml:space="preserve">Paper money is easier to carry than metal coins. · The first credit card was in 1958. · I think the next money will be … · I wish we used … because …</w:t>
+      </w:r>
+    </w:p>
+    <w:p>
+      <w:pPr>
+        <w:spacing w:after="60"/>
+      </w:pPr>
+      <w:r>
+        <w:rPr>
+          <w:b/>
+          <w:bCs/>
+        </w:rPr>
+        <w:t xml:space="preserve">Prepare. </w:t>
+      </w:r>
+      <w:r>
+        <w:t xml:space="preserve">Mini whiteboards not needed. One smartboard (the game Time Train is played by teams in turns).</w:t>
+      </w:r>
+    </w:p>
+    <w:p>
+      <w:pPr>
+        <w:spacing w:before="120"/>
+      </w:pPr>
+    </w:p>
+    <w:tbl>
+      <w:tblPr>
+        <w:tblW w:type="dxa" w:w="9360"/>
+        <w:tblBorders>
+          <w:top w:val="single" w:color="94A3B8" w:sz="4"/>
+          <w:left w:val="single" w:color="94A3B8" w:sz="4"/>
+          <w:bottom w:val="single" w:color="94A3B8" w:sz="4"/>
+          <w:right w:val="single" w:color="94A3B8" w:sz="4"/>
+          <w:insideH w:val="single" w:color="94A3B8" w:sz="4"/>
+          <w:insideV w:val="single" w:color="94A3B8" w:sz="4"/>
+        </w:tblBorders>
+      </w:tblPr>
+      <w:tblGrid>
+        <w:gridCol w:w="500"/>
+        <w:gridCol w:w="1900"/>
+        <w:gridCol w:w="800"/>
+        <w:gridCol w:w="1100"/>
+        <w:gridCol w:w="2900"/>
+        <w:gridCol w:w="2160"/>
+      </w:tblGrid>
+      <w:tr>
+        <w:trPr>
+          <w:tblHeader/>
+        </w:trPr>
+        <w:tc>
+          <w:tcPr>
+            <w:tcW w:type="dxa" w:w="500"/>
+            <w:shd w:fill="E0F2FE" w:color="auto" w:val="clear"/>
+            <w:tcMar>
+              <w:top w:type="dxa" w:w="60"/>
+              <w:left w:type="dxa" w:w="90"/>
+              <w:bottom w:type="dxa" w:w="60"/>
+              <w:right w:type="dxa" w:w="90"/>
+            </w:tcMar>
+          </w:tcPr>
+          <w:p>
+            <w:pPr>
+              <w:spacing w:after="40"/>
+            </w:pPr>
+            <w:r>
+              <w:rPr>
+                <w:b/>
+                <w:bCs/>
+                <w:sz w:val="20"/>
+                <w:szCs w:val="20"/>
+              </w:rPr>
+              <w:t xml:space="preserve">#</w:t>
+            </w:r>
+          </w:p>
+        </w:tc>
+        <w:tc>
+          <w:tcPr>
+            <w:tcW w:type="dxa" w:w="1900"/>
+            <w:shd w:fill="E0F2FE" w:color="auto" w:val="clear"/>
+            <w:tcMar>
+              <w:top w:type="dxa" w:w="60"/>
+              <w:left w:type="dxa" w:w="90"/>
+              <w:bottom w:type="dxa" w:w="60"/>
+              <w:right w:type="dxa" w:w="90"/>
+            </w:tcMar>
+          </w:tcPr>
+          <w:p>
+            <w:pPr>
+              <w:spacing w:after="40"/>
+            </w:pPr>
+            <w:r>
+              <w:rPr>
+                <w:b/>
+                <w:bCs/>
+                <w:sz w:val="20"/>
+                <w:szCs w:val="20"/>
+              </w:rPr>
+              <w:t xml:space="preserve">Step</w:t>
+            </w:r>
+          </w:p>
+        </w:tc>
+        <w:tc>
+          <w:tcPr>
+            <w:tcW w:type="dxa" w:w="800"/>
+            <w:shd w:fill="E0F2FE" w:color="auto" w:val="clear"/>
+            <w:tcMar>
+              <w:top w:type="dxa" w:w="60"/>
+              <w:left w:type="dxa" w:w="90"/>
+              <w:bottom w:type="dxa" w:w="60"/>
+              <w:right w:type="dxa" w:w="90"/>
+            </w:tcMar>
+          </w:tcPr>
+          <w:p>
+            <w:pPr>
+              <w:spacing w:after="40"/>
+            </w:pPr>
+            <w:r>
+              <w:rPr>
+                <w:b/>
+                <w:bCs/>
+                <w:sz w:val="20"/>
+                <w:szCs w:val="20"/>
+              </w:rPr>
+              <w:t xml:space="preserve">Time</w:t>
+            </w:r>
+          </w:p>
+        </w:tc>
+        <w:tc>
+          <w:tcPr>
+            <w:tcW w:type="dxa" w:w="1100"/>
+            <w:shd w:fill="E0F2FE" w:color="auto" w:val="clear"/>
+            <w:tcMar>
+              <w:top w:type="dxa" w:w="60"/>
+              <w:left w:type="dxa" w:w="90"/>
+              <w:bottom w:type="dxa" w:w="60"/>
+              <w:right w:type="dxa" w:w="90"/>
+            </w:tcMar>
+          </w:tcPr>
+          <w:p>
+            <w:pPr>
+              <w:spacing w:after="40"/>
+            </w:pPr>
+            <w:r>
+              <w:rPr>
+                <w:b/>
+                <w:bCs/>
+                <w:sz w:val="20"/>
+                <w:szCs w:val="20"/>
+              </w:rPr>
+              <w:t xml:space="preserve">Mode</w:t>
+            </w:r>
+          </w:p>
+        </w:tc>
+        <w:tc>
+          <w:tcPr>
+            <w:tcW w:type="dxa" w:w="2900"/>
+            <w:shd w:fill="E0F2FE" w:color="auto" w:val="clear"/>
+            <w:tcMar>
+              <w:top w:type="dxa" w:w="60"/>
+              <w:left w:type="dxa" w:w="90"/>
+              <w:bottom w:type="dxa" w:w="60"/>
+              <w:right w:type="dxa" w:w="90"/>
+            </w:tcMar>
+          </w:tcPr>
+          <w:p>
+            <w:pPr>
+              <w:spacing w:after="40"/>
+            </w:pPr>
+            <w:r>
+              <w:rPr>
+                <w:b/>
+                <w:bCs/>
+                <w:sz w:val="20"/>
+                <w:szCs w:val="20"/>
+              </w:rPr>
+              <w:t xml:space="preserve">Pupils do</w:t>
+            </w:r>
+          </w:p>
+        </w:tc>
+        <w:tc>
+          <w:tcPr>
+            <w:tcW w:type="dxa" w:w="2160"/>
+            <w:shd w:fill="E0F2FE" w:color="auto" w:val="clear"/>
+            <w:tcMar>
+              <w:top w:type="dxa" w:w="60"/>
+              <w:left w:type="dxa" w:w="90"/>
+              <w:bottom w:type="dxa" w:w="60"/>
+              <w:right w:type="dxa" w:w="90"/>
+            </w:tcMar>
+          </w:tcPr>
+          <w:p>
+            <w:pPr>
+              <w:spacing w:after="40"/>
+            </w:pPr>
+            <w:r>
+              <w:rPr>
+                <w:b/>
+                <w:bCs/>
+                <w:sz w:val="20"/>
+                <w:szCs w:val="20"/>
+              </w:rPr>
+              <w:t xml:space="preserve">Teacher tips</w:t>
+            </w:r>
+          </w:p>
+        </w:tc>
+      </w:tr>
+      <w:tr>
+        <w:trPr>
+          <w:cantSplit/>
+        </w:trPr>
+        <w:tc>
+          <w:tcPr>
+            <w:tcW w:type="dxa" w:w="500"/>
+            <w:tcMar>
+              <w:top w:type="dxa" w:w="60"/>
+              <w:left w:type="dxa" w:w="90"/>
+              <w:bottom w:type="dxa" w:w="60"/>
+              <w:right w:type="dxa" w:w="90"/>
+            </w:tcMar>
+          </w:tcPr>
+          <w:p>
+            <w:pPr>
+              <w:spacing w:after="40"/>
+            </w:pPr>
+            <w:r>
+              <w:rPr>
+                <w:b w:val="false"/>
+                <w:bCs w:val="false"/>
+                <w:sz w:val="20"/>
+                <w:szCs w:val="20"/>
+              </w:rPr>
+              <w:t xml:space="preserve">1</w:t>
+            </w:r>
+          </w:p>
+        </w:tc>
+        <w:tc>
+          <w:tcPr>
+            <w:tcW w:type="dxa" w:w="1900"/>
+            <w:tcMar>
+              <w:top w:type="dxa" w:w="60"/>
+              <w:left w:type="dxa" w:w="90"/>
+              <w:bottom w:type="dxa" w:w="60"/>
+              <w:right w:type="dxa" w:w="90"/>
+            </w:tcMar>
+          </w:tcPr>
+          <w:p>
+            <w:pPr>
+              <w:spacing w:after="40"/>
+            </w:pPr>
+            <w:r>
+              <w:rPr>
+                <w:b/>
+                <w:bCs/>
+                <w:sz w:val="20"/>
+                <w:szCs w:val="20"/>
+              </w:rPr>
+              <w:t xml:space="preserve">Remember the Money Story</w:t>
+            </w:r>
+          </w:p>
+        </w:tc>
+        <w:tc>
+          <w:tcPr>
+            <w:tcW w:type="dxa" w:w="800"/>
+            <w:tcMar>
+              <w:top w:type="dxa" w:w="60"/>
+              <w:left w:type="dxa" w:w="90"/>
+              <w:bottom w:type="dxa" w:w="60"/>
+              <w:right w:type="dxa" w:w="90"/>
+            </w:tcMar>
+          </w:tcPr>
+          <w:p>
+            <w:pPr>
+              <w:spacing w:after="40"/>
+            </w:pPr>
+            <w:r>
+              <w:rPr>
+                <w:b w:val="false"/>
+                <w:bCs w:val="false"/>
+                <w:sz w:val="20"/>
+                <w:szCs w:val="20"/>
+              </w:rPr>
+              <w:t xml:space="preserve">3 min</w:t>
+            </w:r>
+          </w:p>
+        </w:tc>
+        <w:tc>
+          <w:tcPr>
+            <w:tcW w:type="dxa" w:w="1100"/>
+            <w:tcMar>
+              <w:top w:type="dxa" w:w="60"/>
+              <w:left w:type="dxa" w:w="90"/>
+              <w:bottom w:type="dxa" w:w="60"/>
+              <w:right w:type="dxa" w:w="90"/>
+            </w:tcMar>
+          </w:tcPr>
+          <w:p>
+            <w:pPr>
+              <w:spacing w:after="40"/>
+            </w:pPr>
+            <w:r>
+              <w:rPr>
+                <w:b w:val="false"/>
+                <w:bCs w:val="false"/>
+                <w:sz w:val="20"/>
+                <w:szCs w:val="20"/>
+              </w:rPr>
+              <w:t xml:space="preserve">Think</w:t>
+            </w:r>
+          </w:p>
+        </w:tc>
+        <w:tc>
+          <w:tcPr>
+            <w:tcW w:type="dxa" w:w="2900"/>
+            <w:tcMar>
+              <w:top w:type="dxa" w:w="60"/>
+              <w:left w:type="dxa" w:w="90"/>
+              <w:bottom w:type="dxa" w:w="60"/>
+              <w:right w:type="dxa" w:w="90"/>
+            </w:tcMar>
+          </w:tcPr>
+          <w:p>
+            <w:pPr>
+              <w:spacing w:after="40"/>
+            </w:pPr>
+            <w:r>
+              <w:rPr>
+                <w:b w:val="false"/>
+                <w:bCs w:val="false"/>
+                <w:sz w:val="18"/>
+                <w:szCs w:val="18"/>
+              </w:rPr>
+              <w:t xml:space="preserve">• Look at the pictures</w:t>
+            </w:r>
+          </w:p>
+          <w:p>
+            <w:pPr>
+              <w:spacing w:after="40"/>
+            </w:pPr>
+            <w:r>
+              <w:rPr>
+                <w:b w:val="false"/>
+                <w:bCs w:val="false"/>
+                <w:sz w:val="18"/>
+                <w:szCs w:val="18"/>
+              </w:rPr>
+              <w:t xml:space="preserve">• Whisper to your partner: what do you remember?</w:t>
+            </w:r>
+          </w:p>
+          <w:p>
+            <w:pPr>
+              <w:spacing w:after="40"/>
+            </w:pPr>
+            <w:r>
+              <w:rPr>
+                <w:b w:val="false"/>
+                <w:bCs w:val="false"/>
+                <w:sz w:val="18"/>
+                <w:szCs w:val="18"/>
+              </w:rPr>
+              <w:t xml:space="preserve">• Tell the class</w:t>
+            </w:r>
+          </w:p>
+          <w:p>
+            <w:pPr>
+              <w:spacing w:after="40"/>
+            </w:pPr>
+            <w:r>
+              <w:rPr>
+                <w:b w:val="false"/>
+                <w:bCs w:val="false"/>
+                <w:sz w:val="18"/>
+                <w:szCs w:val="18"/>
+              </w:rPr>
+              <w:t xml:space="preserve">Say: People bartered. · Shells are easier to carry than goats.</w:t>
+            </w:r>
+          </w:p>
+        </w:tc>
+        <w:tc>
+          <w:tcPr>
+            <w:tcW w:type="dxa" w:w="2160"/>
+            <w:tcMar>
+              <w:top w:type="dxa" w:w="60"/>
+              <w:left w:type="dxa" w:w="90"/>
+              <w:bottom w:type="dxa" w:w="60"/>
+              <w:right w:type="dxa" w:w="90"/>
+            </w:tcMar>
+          </w:tcPr>
+          <w:p>
+            <w:pPr>
+              <w:spacing w:after="40"/>
+            </w:pPr>
+            <w:r>
+              <w:rPr>
+                <w:b w:val="false"/>
+                <w:bCs w:val="false"/>
+                <w:sz w:val="17"/>
+                <w:szCs w:val="17"/>
+              </w:rPr>
+              <w:t xml:space="preserve">Book link: recap of pp.42-43 (barter, cowrie shells, knives and spades, the first coins) before pp.44-45.</w:t>
+            </w:r>
+          </w:p>
+          <w:p>
+            <w:pPr>
+              <w:spacing w:after="40"/>
+            </w:pPr>
+            <w:r>
+              <w:rPr>
+                <w:b w:val="false"/>
+                <w:bCs w:val="false"/>
+                <w:sz w:val="17"/>
+                <w:szCs w:val="17"/>
+              </w:rPr>
+              <w:t xml:space="preserve">Press the button for each question. Accept one-word answers and sentences. Show the six missions at the end.</w:t>
+            </w:r>
+          </w:p>
+        </w:tc>
+      </w:tr>
+      <w:tr>
+        <w:trPr>
+          <w:cantSplit/>
+        </w:trPr>
+        <w:tc>
+          <w:tcPr>
+            <w:tcW w:type="dxa" w:w="500"/>
+            <w:tcMar>
+              <w:top w:type="dxa" w:w="60"/>
+              <w:left w:type="dxa" w:w="90"/>
+              <w:bottom w:type="dxa" w:w="60"/>
+              <w:right w:type="dxa" w:w="90"/>
+            </w:tcMar>
+          </w:tcPr>
+          <w:p>
+            <w:pPr>
+              <w:spacing w:after="40"/>
+            </w:pPr>
+            <w:r>
+              <w:rPr>
+                <w:b w:val="false"/>
+                <w:bCs w:val="false"/>
+                <w:sz w:val="20"/>
+                <w:szCs w:val="20"/>
+              </w:rPr>
+              <w:t xml:space="preserve">2</w:t>
+            </w:r>
+          </w:p>
+        </w:tc>
+        <w:tc>
+          <w:tcPr>
+            <w:tcW w:type="dxa" w:w="1900"/>
+            <w:tcMar>
+              <w:top w:type="dxa" w:w="60"/>
+              <w:left w:type="dxa" w:w="90"/>
+              <w:bottom w:type="dxa" w:w="60"/>
+              <w:right w:type="dxa" w:w="90"/>
+            </w:tcMar>
+          </w:tcPr>
+          <w:p>
+            <w:pPr>
+              <w:spacing w:after="40"/>
+            </w:pPr>
+            <w:r>
+              <w:rPr>
+                <w:b/>
+                <w:bCs/>
+                <w:sz w:val="20"/>
+                <w:szCs w:val="20"/>
+              </w:rPr>
+              <w:t xml:space="preserve">From Coins to Cards</w:t>
+            </w:r>
+          </w:p>
+        </w:tc>
+        <w:tc>
+          <w:tcPr>
+            <w:tcW w:type="dxa" w:w="800"/>
+            <w:tcMar>
+              <w:top w:type="dxa" w:w="60"/>
+              <w:left w:type="dxa" w:w="90"/>
+              <w:bottom w:type="dxa" w:w="60"/>
+              <w:right w:type="dxa" w:w="90"/>
+            </w:tcMar>
+          </w:tcPr>
+          <w:p>
+            <w:pPr>
+              <w:spacing w:after="40"/>
+            </w:pPr>
+            <w:r>
+              <w:rPr>
+                <w:b w:val="false"/>
+                <w:bCs w:val="false"/>
+                <w:sz w:val="20"/>
+                <w:szCs w:val="20"/>
+              </w:rPr>
+              <w:t xml:space="preserve">7 min</w:t>
+            </w:r>
+          </w:p>
+        </w:tc>
+        <w:tc>
+          <w:tcPr>
+            <w:tcW w:type="dxa" w:w="1100"/>
+            <w:tcMar>
+              <w:top w:type="dxa" w:w="60"/>
+              <w:left w:type="dxa" w:w="90"/>
+              <w:bottom w:type="dxa" w:w="60"/>
+              <w:right w:type="dxa" w:w="90"/>
+            </w:tcMar>
+          </w:tcPr>
+          <w:p>
+            <w:pPr>
+              <w:spacing w:after="40"/>
+            </w:pPr>
+            <w:r>
+              <w:rPr>
+                <w:b w:val="false"/>
+                <w:bCs w:val="false"/>
+                <w:sz w:val="20"/>
+                <w:szCs w:val="20"/>
+              </w:rPr>
+              <w:t xml:space="preserve">Act it out</w:t>
+            </w:r>
+          </w:p>
+        </w:tc>
+        <w:tc>
+          <w:tcPr>
+            <w:tcW w:type="dxa" w:w="2900"/>
+            <w:tcMar>
+              <w:top w:type="dxa" w:w="60"/>
+              <w:left w:type="dxa" w:w="90"/>
+              <w:bottom w:type="dxa" w:w="60"/>
+              <w:right w:type="dxa" w:w="90"/>
+            </w:tcMar>
+          </w:tcPr>
+          <w:p>
+            <w:pPr>
+              <w:spacing w:after="40"/>
+            </w:pPr>
+            <w:r>
+              <w:rPr>
+                <w:b w:val="false"/>
+                <w:bCs w:val="false"/>
+                <w:sz w:val="18"/>
+                <w:szCs w:val="18"/>
+              </w:rPr>
+              <w:t xml:space="preserve">• Stand up and do the action</w:t>
+            </w:r>
+          </w:p>
+          <w:p>
+            <w:pPr>
+              <w:spacing w:after="40"/>
+            </w:pPr>
+            <w:r>
+              <w:rPr>
+                <w:b w:val="false"/>
+                <w:bCs w:val="false"/>
+                <w:sz w:val="18"/>
+                <w:szCs w:val="18"/>
+              </w:rPr>
+              <w:t xml:space="preserve">• Repeat after the teacher (echo)</w:t>
+            </w:r>
+          </w:p>
+          <w:p>
+            <w:pPr>
+              <w:spacing w:after="40"/>
+            </w:pPr>
+            <w:r>
+              <w:rPr>
+                <w:b w:val="false"/>
+                <w:bCs w:val="false"/>
+                <w:sz w:val="18"/>
+                <w:szCs w:val="18"/>
+              </w:rPr>
+              <w:t xml:space="preserve">• At the end, retell it to a partner</w:t>
+            </w:r>
+          </w:p>
+          <w:p>
+            <w:pPr>
+              <w:spacing w:after="40"/>
+            </w:pPr>
+            <w:r>
+              <w:rPr>
+                <w:b w:val="false"/>
+                <w:bCs w:val="false"/>
+                <w:sz w:val="18"/>
+                <w:szCs w:val="18"/>
+              </w:rPr>
+              <w:t xml:space="preserve">Say: Paper money is easier to carry. · The first credit card was in 1958.</w:t>
+            </w:r>
+          </w:p>
+        </w:tc>
+        <w:tc>
+          <w:tcPr>
+            <w:tcW w:type="dxa" w:w="2160"/>
+            <w:tcMar>
+              <w:top w:type="dxa" w:w="60"/>
+              <w:left w:type="dxa" w:w="90"/>
+              <w:bottom w:type="dxa" w:w="60"/>
+              <w:right w:type="dxa" w:w="90"/>
+            </w:tcMar>
+          </w:tcPr>
+          <w:p>
+            <w:pPr>
+              <w:spacing w:after="40"/>
+            </w:pPr>
+            <w:r>
+              <w:rPr>
+                <w:b w:val="false"/>
+                <w:bCs w:val="false"/>
+                <w:sz w:val="17"/>
+                <w:szCs w:val="17"/>
+              </w:rPr>
+              <w:t xml:space="preserve">Book link: pp.44-45, Reading 1 "The History of Money" (coins from silver and gold, the first paper money from China between 800 and 900 CE, Europe around 1600 CE, the first credit card in 1958, electronic money in the 21st century) and the timeline strip on pp.44-45.</w:t>
+            </w:r>
+          </w:p>
+          <w:p>
+            <w:pPr>
+              <w:spacing w:after="40"/>
+            </w:pPr>
+            <w:r>
+              <w:rPr>
+                <w:b w:val="false"/>
+                <w:bCs w:val="false"/>
+                <w:sz w:val="17"/>
+                <w:szCs w:val="17"/>
+              </w:rPr>
+              <w:t xml:space="preserve">The timeline fills as the story goes. At the 🤔 part pupils guess what is easier to carry than coins. Press Reveal.</w:t>
+            </w:r>
+          </w:p>
+          <w:p>
+            <w:pPr>
+              <w:spacing w:after="40"/>
+            </w:pPr>
+            <w:r>
+              <w:rPr>
+                <w:b w:val="false"/>
+                <w:bCs w:val="false"/>
+                <w:sz w:val="17"/>
+                <w:szCs w:val="17"/>
+              </w:rPr>
+              <w:t xml:space="preserve">CE means "Common Era" (the book asked "Can you guess what CE stands for?" on p.42). Today a pupil may be able to say it.</w:t>
+            </w:r>
+          </w:p>
+        </w:tc>
+      </w:tr>
+      <w:tr>
+        <w:trPr>
+          <w:cantSplit/>
+        </w:trPr>
+        <w:tc>
+          <w:tcPr>
+            <w:tcW w:type="dxa" w:w="500"/>
+            <w:tcMar>
+              <w:top w:type="dxa" w:w="60"/>
+              <w:left w:type="dxa" w:w="90"/>
+              <w:bottom w:type="dxa" w:w="60"/>
+              <w:right w:type="dxa" w:w="90"/>
+            </w:tcMar>
+          </w:tcPr>
+          <w:p>
+            <w:pPr>
+              <w:spacing w:after="40"/>
+            </w:pPr>
+            <w:r>
+              <w:rPr>
+                <w:b w:val="false"/>
+                <w:bCs w:val="false"/>
+                <w:sz w:val="20"/>
+                <w:szCs w:val="20"/>
+              </w:rPr>
+              <w:t xml:space="preserve">3</w:t>
+            </w:r>
+          </w:p>
+        </w:tc>
+        <w:tc>
+          <w:tcPr>
+            <w:tcW w:type="dxa" w:w="1900"/>
+            <w:tcMar>
+              <w:top w:type="dxa" w:w="60"/>
+              <w:left w:type="dxa" w:w="90"/>
+              <w:bottom w:type="dxa" w:w="60"/>
+              <w:right w:type="dxa" w:w="90"/>
+            </w:tcMar>
+          </w:tcPr>
+          <w:p>
+            <w:pPr>
+              <w:spacing w:after="40"/>
+            </w:pPr>
+            <w:r>
+              <w:rPr>
+                <w:b/>
+                <w:bCs/>
+                <w:sz w:val="20"/>
+                <w:szCs w:val="20"/>
+              </w:rPr>
+              <w:t xml:space="preserve">Six Money Words</w:t>
+            </w:r>
+          </w:p>
+        </w:tc>
+        <w:tc>
+          <w:tcPr>
+            <w:tcW w:type="dxa" w:w="800"/>
+            <w:tcMar>
+              <w:top w:type="dxa" w:w="60"/>
+              <w:left w:type="dxa" w:w="90"/>
+              <w:bottom w:type="dxa" w:w="60"/>
+              <w:right w:type="dxa" w:w="90"/>
+            </w:tcMar>
+          </w:tcPr>
+          <w:p>
+            <w:pPr>
+              <w:spacing w:after="40"/>
+            </w:pPr>
+            <w:r>
+              <w:rPr>
+                <w:b w:val="false"/>
+                <w:bCs w:val="false"/>
+                <w:sz w:val="20"/>
+                <w:szCs w:val="20"/>
+              </w:rPr>
+              <w:t xml:space="preserve">5 min</w:t>
+            </w:r>
+          </w:p>
+        </w:tc>
+        <w:tc>
+          <w:tcPr>
+            <w:tcW w:type="dxa" w:w="1100"/>
+            <w:tcMar>
+              <w:top w:type="dxa" w:w="60"/>
+              <w:left w:type="dxa" w:w="90"/>
+              <w:bottom w:type="dxa" w:w="60"/>
+              <w:right w:type="dxa" w:w="90"/>
+            </w:tcMar>
+          </w:tcPr>
+          <w:p>
+            <w:pPr>
+              <w:spacing w:after="40"/>
+            </w:pPr>
+            <w:r>
+              <w:rPr>
+                <w:b w:val="false"/>
+                <w:bCs w:val="false"/>
+                <w:sz w:val="20"/>
+                <w:szCs w:val="20"/>
+              </w:rPr>
+              <w:t xml:space="preserve">Detective</w:t>
+            </w:r>
+          </w:p>
+        </w:tc>
+        <w:tc>
+          <w:tcPr>
+            <w:tcW w:type="dxa" w:w="2900"/>
+            <w:tcMar>
+              <w:top w:type="dxa" w:w="60"/>
+              <w:left w:type="dxa" w:w="90"/>
+              <w:bottom w:type="dxa" w:w="60"/>
+              <w:right w:type="dxa" w:w="90"/>
+            </w:tcMar>
+          </w:tcPr>
+          <w:p>
+            <w:pPr>
+              <w:spacing w:after="40"/>
+            </w:pPr>
+            <w:r>
+              <w:rPr>
+                <w:b w:val="false"/>
+                <w:bCs w:val="false"/>
+                <w:sz w:val="18"/>
+                <w:szCs w:val="18"/>
+              </w:rPr>
+              <w:t xml:space="preserve">• Look at the word card</w:t>
+            </w:r>
+          </w:p>
+          <w:p>
+            <w:pPr>
+              <w:spacing w:after="40"/>
+            </w:pPr>
+            <w:r>
+              <w:rPr>
+                <w:b w:val="false"/>
+                <w:bCs w:val="false"/>
+                <w:sz w:val="18"/>
+                <w:szCs w:val="18"/>
+              </w:rPr>
+              <w:t xml:space="preserve">• Guess the meaning with your partner</w:t>
+            </w:r>
+          </w:p>
+          <w:p>
+            <w:pPr>
+              <w:spacing w:after="40"/>
+            </w:pPr>
+            <w:r>
+              <w:rPr>
+                <w:b w:val="false"/>
+                <w:bCs w:val="false"/>
+                <w:sz w:val="18"/>
+                <w:szCs w:val="18"/>
+              </w:rPr>
+              <w:t xml:space="preserve">• Say the word and the sentence</w:t>
+            </w:r>
+          </w:p>
+          <w:p>
+            <w:pPr>
+              <w:spacing w:after="40"/>
+            </w:pPr>
+            <w:r>
+              <w:rPr>
+                <w:b w:val="false"/>
+                <w:bCs w:val="false"/>
+                <w:sz w:val="18"/>
+                <w:szCs w:val="18"/>
+              </w:rPr>
+              <w:t xml:space="preserve">Say: coin · credit card · electronic money</w:t>
+            </w:r>
+          </w:p>
+        </w:tc>
+        <w:tc>
+          <w:tcPr>
+            <w:tcW w:type="dxa" w:w="2160"/>
+            <w:tcMar>
+              <w:top w:type="dxa" w:w="60"/>
+              <w:left w:type="dxa" w:w="90"/>
+              <w:bottom w:type="dxa" w:w="60"/>
+              <w:right w:type="dxa" w:w="90"/>
+            </w:tcMar>
+          </w:tcPr>
+          <w:p>
+            <w:pPr>
+              <w:spacing w:after="40"/>
+            </w:pPr>
+            <w:r>
+              <w:rPr>
+                <w:b w:val="false"/>
+                <w:bCs w:val="false"/>
+                <w:sz w:val="17"/>
+                <w:szCs w:val="17"/>
+              </w:rPr>
+              <w:t xml:space="preserve">Book link: pp.44-45 (coin, paper money, credit card, electronic money, internet, centuries). "Credit card" was a Words in Context word on p.43.</w:t>
+            </w:r>
+          </w:p>
+          <w:p>
+            <w:pPr>
+              <w:spacing w:after="40"/>
+            </w:pPr>
+            <w:r>
+              <w:rPr>
+                <w:b w:val="false"/>
+                <w:bCs w:val="false"/>
+                <w:sz w:val="17"/>
+                <w:szCs w:val="17"/>
+              </w:rPr>
+              <w:t xml:space="preserve">Tap a card: the board says the word, the meaning and an example sentence. Then press Clue game: pupils say the missing word.</w:t>
+            </w:r>
+          </w:p>
+        </w:tc>
+      </w:tr>
+      <w:tr>
+        <w:trPr>
+          <w:cantSplit/>
+        </w:trPr>
+        <w:tc>
+          <w:tcPr>
+            <w:tcW w:type="dxa" w:w="500"/>
+            <w:tcMar>
+              <w:top w:type="dxa" w:w="60"/>
+              <w:left w:type="dxa" w:w="90"/>
+              <w:bottom w:type="dxa" w:w="60"/>
+              <w:right w:type="dxa" w:w="90"/>
+            </w:tcMar>
+          </w:tcPr>
+          <w:p>
+            <w:pPr>
+              <w:spacing w:after="40"/>
+            </w:pPr>
+            <w:r>
+              <w:rPr>
+                <w:b w:val="false"/>
+                <w:bCs w:val="false"/>
+                <w:sz w:val="20"/>
+                <w:szCs w:val="20"/>
+              </w:rPr>
+              <w:t xml:space="preserve">4</w:t>
+            </w:r>
+          </w:p>
+        </w:tc>
+        <w:tc>
+          <w:tcPr>
+            <w:tcW w:type="dxa" w:w="1900"/>
+            <w:tcMar>
+              <w:top w:type="dxa" w:w="60"/>
+              <w:left w:type="dxa" w:w="90"/>
+              <w:bottom w:type="dxa" w:w="60"/>
+              <w:right w:type="dxa" w:w="90"/>
+            </w:tcMar>
+          </w:tcPr>
+          <w:p>
+            <w:pPr>
+              <w:spacing w:after="40"/>
+            </w:pPr>
+            <w:r>
+              <w:rPr>
+                <w:b/>
+                <w:bCs/>
+                <w:sz w:val="20"/>
+                <w:szCs w:val="20"/>
+              </w:rPr>
+              <w:t xml:space="preserve">Easier to Carry</w:t>
+            </w:r>
+          </w:p>
+        </w:tc>
+        <w:tc>
+          <w:tcPr>
+            <w:tcW w:type="dxa" w:w="800"/>
+            <w:tcMar>
+              <w:top w:type="dxa" w:w="60"/>
+              <w:left w:type="dxa" w:w="90"/>
+              <w:bottom w:type="dxa" w:w="60"/>
+              <w:right w:type="dxa" w:w="90"/>
+            </w:tcMar>
+          </w:tcPr>
+          <w:p>
+            <w:pPr>
+              <w:spacing w:after="40"/>
+            </w:pPr>
+            <w:r>
+              <w:rPr>
+                <w:b w:val="false"/>
+                <w:bCs w:val="false"/>
+                <w:sz w:val="20"/>
+                <w:szCs w:val="20"/>
+              </w:rPr>
+              <w:t xml:space="preserve">4 min</w:t>
+            </w:r>
+          </w:p>
+        </w:tc>
+        <w:tc>
+          <w:tcPr>
+            <w:tcW w:type="dxa" w:w="1100"/>
+            <w:tcMar>
+              <w:top w:type="dxa" w:w="60"/>
+              <w:left w:type="dxa" w:w="90"/>
+              <w:bottom w:type="dxa" w:w="60"/>
+              <w:right w:type="dxa" w:w="90"/>
+            </w:tcMar>
+          </w:tcPr>
+          <w:p>
+            <w:pPr>
+              <w:spacing w:after="40"/>
+            </w:pPr>
+            <w:r>
+              <w:rPr>
+                <w:b w:val="false"/>
+                <w:bCs w:val="false"/>
+                <w:sz w:val="20"/>
+                <w:szCs w:val="20"/>
+              </w:rPr>
+              <w:t xml:space="preserve">Talk</w:t>
+            </w:r>
+          </w:p>
+        </w:tc>
+        <w:tc>
+          <w:tcPr>
+            <w:tcW w:type="dxa" w:w="2900"/>
+            <w:tcMar>
+              <w:top w:type="dxa" w:w="60"/>
+              <w:left w:type="dxa" w:w="90"/>
+              <w:bottom w:type="dxa" w:w="60"/>
+              <w:right w:type="dxa" w:w="90"/>
+            </w:tcMar>
+          </w:tcPr>
+          <w:p>
+            <w:pPr>
+              <w:spacing w:after="40"/>
+            </w:pPr>
+            <w:r>
+              <w:rPr>
+                <w:b w:val="false"/>
+                <w:bCs w:val="false"/>
+                <w:sz w:val="18"/>
+                <w:szCs w:val="18"/>
+              </w:rPr>
+              <w:t xml:space="preserve">• Tap a pair with your partner</w:t>
+            </w:r>
+          </w:p>
+          <w:p>
+            <w:pPr>
+              <w:spacing w:after="40"/>
+            </w:pPr>
+            <w:r>
+              <w:rPr>
+                <w:b w:val="false"/>
+                <w:bCs w:val="false"/>
+                <w:sz w:val="18"/>
+                <w:szCs w:val="18"/>
+              </w:rPr>
+              <w:t xml:space="preserve">• Say: … is easier to carry than …</w:t>
+            </w:r>
+          </w:p>
+          <w:p>
+            <w:pPr>
+              <w:spacing w:after="40"/>
+            </w:pPr>
+            <w:r>
+              <w:rPr>
+                <w:b w:val="false"/>
+                <w:bCs w:val="false"/>
+                <w:sz w:val="18"/>
+                <w:szCs w:val="18"/>
+              </w:rPr>
+              <w:t xml:space="preserve">• Which do you like? Why?</w:t>
+            </w:r>
+          </w:p>
+          <w:p>
+            <w:pPr>
+              <w:spacing w:after="40"/>
+            </w:pPr>
+            <w:r>
+              <w:rPr>
+                <w:b w:val="false"/>
+                <w:bCs w:val="false"/>
+                <w:sz w:val="18"/>
+                <w:szCs w:val="18"/>
+              </w:rPr>
+              <w:t xml:space="preserve">Say: … is easier to carry than … · I like … because …</w:t>
+            </w:r>
+          </w:p>
+        </w:tc>
+        <w:tc>
+          <w:tcPr>
+            <w:tcW w:type="dxa" w:w="2160"/>
+            <w:tcMar>
+              <w:top w:type="dxa" w:w="60"/>
+              <w:left w:type="dxa" w:w="90"/>
+              <w:bottom w:type="dxa" w:w="60"/>
+              <w:right w:type="dxa" w:w="90"/>
+            </w:tcMar>
+          </w:tcPr>
+          <w:p>
+            <w:pPr>
+              <w:spacing w:after="40"/>
+            </w:pPr>
+            <w:r>
+              <w:rPr>
+                <w:b w:val="false"/>
+                <w:bCs w:val="false"/>
+                <w:sz w:val="17"/>
+                <w:szCs w:val="17"/>
+              </w:rPr>
+              <w:t xml:space="preserve">Book link: pp.42-44 (shells easier to carry than goats or bags of grain; paper money easier to carry than metal coins).</w:t>
+            </w:r>
+          </w:p>
+          <w:p>
+            <w:pPr>
+              <w:spacing w:after="40"/>
+            </w:pPr>
+            <w:r>
+              <w:rPr>
+                <w:b w:val="false"/>
+                <w:bCs w:val="false"/>
+                <w:sz w:val="17"/>
+                <w:szCs w:val="17"/>
+              </w:rPr>
+              <w:t xml:space="preserve">Model one sentence, then pupils say the rest. Support: say only the two words. Stretch: add "because".</w:t>
+            </w:r>
+          </w:p>
+        </w:tc>
+      </w:tr>
+      <w:tr>
+        <w:trPr>
+          <w:cantSplit/>
+        </w:trPr>
+        <w:tc>
+          <w:tcPr>
+            <w:tcW w:type="dxa" w:w="500"/>
+            <w:tcMar>
+              <w:top w:type="dxa" w:w="60"/>
+              <w:left w:type="dxa" w:w="90"/>
+              <w:bottom w:type="dxa" w:w="60"/>
+              <w:right w:type="dxa" w:w="90"/>
+            </w:tcMar>
+          </w:tcPr>
+          <w:p>
+            <w:pPr>
+              <w:spacing w:after="40"/>
+            </w:pPr>
+            <w:r>
+              <w:rPr>
+                <w:b w:val="false"/>
+                <w:bCs w:val="false"/>
+                <w:sz w:val="20"/>
+                <w:szCs w:val="20"/>
+              </w:rPr>
+              <w:t xml:space="preserve">5</w:t>
+            </w:r>
+          </w:p>
+        </w:tc>
+        <w:tc>
+          <w:tcPr>
+            <w:tcW w:type="dxa" w:w="1900"/>
+            <w:tcMar>
+              <w:top w:type="dxa" w:w="60"/>
+              <w:left w:type="dxa" w:w="90"/>
+              <w:bottom w:type="dxa" w:w="60"/>
+              <w:right w:type="dxa" w:w="90"/>
+            </w:tcMar>
+          </w:tcPr>
+          <w:p>
+            <w:pPr>
+              <w:spacing w:after="40"/>
+            </w:pPr>
+            <w:r>
+              <w:rPr>
+                <w:b/>
+                <w:bCs/>
+                <w:sz w:val="20"/>
+                <w:szCs w:val="20"/>
+              </w:rPr>
+              <w:t xml:space="preserve">GAME: Time Train</w:t>
+            </w:r>
+          </w:p>
+        </w:tc>
+        <w:tc>
+          <w:tcPr>
+            <w:tcW w:type="dxa" w:w="800"/>
+            <w:tcMar>
+              <w:top w:type="dxa" w:w="60"/>
+              <w:left w:type="dxa" w:w="90"/>
+              <w:bottom w:type="dxa" w:w="60"/>
+              <w:right w:type="dxa" w:w="90"/>
+            </w:tcMar>
+          </w:tcPr>
+          <w:p>
+            <w:pPr>
+              <w:spacing w:after="40"/>
+            </w:pPr>
+            <w:r>
+              <w:rPr>
+                <w:b w:val="false"/>
+                <w:bCs w:val="false"/>
+                <w:sz w:val="20"/>
+                <w:szCs w:val="20"/>
+              </w:rPr>
+              <w:t xml:space="preserve">9 min</w:t>
+            </w:r>
+          </w:p>
+        </w:tc>
+        <w:tc>
+          <w:tcPr>
+            <w:tcW w:type="dxa" w:w="1100"/>
+            <w:tcMar>
+              <w:top w:type="dxa" w:w="60"/>
+              <w:left w:type="dxa" w:w="90"/>
+              <w:bottom w:type="dxa" w:w="60"/>
+              <w:right w:type="dxa" w:w="90"/>
+            </w:tcMar>
+          </w:tcPr>
+          <w:p>
+            <w:pPr>
+              <w:spacing w:after="40"/>
+            </w:pPr>
+            <w:r>
+              <w:rPr>
+                <w:b w:val="false"/>
+                <w:bCs w:val="false"/>
+                <w:sz w:val="20"/>
+                <w:szCs w:val="20"/>
+              </w:rPr>
+              <w:t xml:space="preserve">Game</w:t>
+            </w:r>
+          </w:p>
+        </w:tc>
+        <w:tc>
+          <w:tcPr>
+            <w:tcW w:type="dxa" w:w="2900"/>
+            <w:tcMar>
+              <w:top w:type="dxa" w:w="60"/>
+              <w:left w:type="dxa" w:w="90"/>
+              <w:bottom w:type="dxa" w:w="60"/>
+              <w:right w:type="dxa" w:w="90"/>
+            </w:tcMar>
+          </w:tcPr>
+          <w:p>
+            <w:pPr>
+              <w:spacing w:after="40"/>
+            </w:pPr>
+            <w:r>
+              <w:rPr>
+                <w:b w:val="false"/>
+                <w:bCs w:val="false"/>
+                <w:sz w:val="18"/>
+                <w:szCs w:val="18"/>
+              </w:rPr>
+              <w:t xml:space="preserve">• Listen to the question</w:t>
+            </w:r>
+          </w:p>
+          <w:p>
+            <w:pPr>
+              <w:spacing w:after="40"/>
+            </w:pPr>
+            <w:r>
+              <w:rPr>
+                <w:b w:val="false"/>
+                <w:bCs w:val="false"/>
+                <w:sz w:val="18"/>
+                <w:szCs w:val="18"/>
+              </w:rPr>
+              <w:t xml:space="preserve">• Talk with your team, then answer</w:t>
+            </w:r>
+          </w:p>
+          <w:p>
+            <w:pPr>
+              <w:spacing w:after="40"/>
+            </w:pPr>
+            <w:r>
+              <w:rPr>
+                <w:b w:val="false"/>
+                <w:bCs w:val="false"/>
+                <w:sz w:val="18"/>
+                <w:szCs w:val="18"/>
+              </w:rPr>
+              <w:t xml:space="preserve">• A right answer moves the train</w:t>
+            </w:r>
+          </w:p>
+          <w:p>
+            <w:pPr>
+              <w:spacing w:after="40"/>
+            </w:pPr>
+            <w:r>
+              <w:rPr>
+                <w:b w:val="false"/>
+                <w:bCs w:val="false"/>
+                <w:sz w:val="18"/>
+                <w:szCs w:val="18"/>
+              </w:rPr>
+              <w:t xml:space="preserve">Say: I think it is … · The answer is …</w:t>
+            </w:r>
+          </w:p>
+        </w:tc>
+        <w:tc>
+          <w:tcPr>
+            <w:tcW w:type="dxa" w:w="2160"/>
+            <w:tcMar>
+              <w:top w:type="dxa" w:w="60"/>
+              <w:left w:type="dxa" w:w="90"/>
+              <w:bottom w:type="dxa" w:w="60"/>
+              <w:right w:type="dxa" w:w="90"/>
+            </w:tcMar>
+          </w:tcPr>
+          <w:p>
+            <w:pPr>
+              <w:spacing w:after="40"/>
+            </w:pPr>
+            <w:r>
+              <w:rPr>
+                <w:b w:val="false"/>
+                <w:bCs w:val="false"/>
+                <w:sz w:val="17"/>
+                <w:szCs w:val="17"/>
+              </w:rPr>
+              <w:t xml:space="preserve">Book link: the timeline on pp.44-45 (barter, cowrie shells, knives and spades, first coins, paper money, credit card, electronic money).</w:t>
+            </w:r>
+          </w:p>
+          <w:p>
+            <w:pPr>
+              <w:spacing w:after="40"/>
+            </w:pPr>
+            <w:r>
+              <w:rPr>
+                <w:b w:val="false"/>
+                <w:bCs w:val="false"/>
+                <w:sz w:val="17"/>
+                <w:szCs w:val="17"/>
+              </w:rPr>
+              <w:t xml:space="preserve">Teams take turns. The team talks for 10 seconds, then one pupil taps the answer. Right = 2 points and the train moves. Wrong = the next team can steal the question for 1 point. If nobody gets it, the answer is shown and the train moves.</w:t>
+            </w:r>
+          </w:p>
+          <w:p>
+            <w:pPr>
+              <w:spacing w:after="40"/>
+            </w:pPr>
+            <w:r>
+              <w:rPr>
+                <w:b w:val="false"/>
+                <w:bCs w:val="false"/>
+                <w:sz w:val="17"/>
+                <w:szCs w:val="17"/>
+              </w:rPr>
+              <w:t xml:space="preserve">Press Next stop after each question. After the last station the winner is shown.</w:t>
+            </w:r>
+          </w:p>
+        </w:tc>
+      </w:tr>
+      <w:tr>
+        <w:trPr>
+          <w:cantSplit/>
+        </w:trPr>
+        <w:tc>
+          <w:tcPr>
+            <w:tcW w:type="dxa" w:w="500"/>
+            <w:tcMar>
+              <w:top w:type="dxa" w:w="60"/>
+              <w:left w:type="dxa" w:w="90"/>
+              <w:bottom w:type="dxa" w:w="60"/>
+              <w:right w:type="dxa" w:w="90"/>
+            </w:tcMar>
+          </w:tcPr>
+          <w:p>
+            <w:pPr>
+              <w:spacing w:after="40"/>
+            </w:pPr>
+            <w:r>
+              <w:rPr>
+                <w:b w:val="false"/>
+                <w:bCs w:val="false"/>
+                <w:sz w:val="20"/>
+                <w:szCs w:val="20"/>
+              </w:rPr>
+              <w:t xml:space="preserve">6</w:t>
+            </w:r>
+          </w:p>
+        </w:tc>
+        <w:tc>
+          <w:tcPr>
+            <w:tcW w:type="dxa" w:w="1900"/>
+            <w:tcMar>
+              <w:top w:type="dxa" w:w="60"/>
+              <w:left w:type="dxa" w:w="90"/>
+              <w:bottom w:type="dxa" w:w="60"/>
+              <w:right w:type="dxa" w:w="90"/>
+            </w:tcMar>
+          </w:tcPr>
+          <w:p>
+            <w:pPr>
+              <w:spacing w:after="40"/>
+            </w:pPr>
+            <w:r>
+              <w:rPr>
+                <w:b/>
+                <w:bCs/>
+                <w:sz w:val="20"/>
+                <w:szCs w:val="20"/>
+              </w:rPr>
+              <w:t xml:space="preserve">What Is Next? Vote!</w:t>
+            </w:r>
+          </w:p>
+        </w:tc>
+        <w:tc>
+          <w:tcPr>
+            <w:tcW w:type="dxa" w:w="800"/>
+            <w:tcMar>
+              <w:top w:type="dxa" w:w="60"/>
+              <w:left w:type="dxa" w:w="90"/>
+              <w:bottom w:type="dxa" w:w="60"/>
+              <w:right w:type="dxa" w:w="90"/>
+            </w:tcMar>
+          </w:tcPr>
+          <w:p>
+            <w:pPr>
+              <w:spacing w:after="40"/>
+            </w:pPr>
+            <w:r>
+              <w:rPr>
+                <w:b w:val="false"/>
+                <w:bCs w:val="false"/>
+                <w:sz w:val="20"/>
+                <w:szCs w:val="20"/>
+              </w:rPr>
+              <w:t xml:space="preserve">4 min</w:t>
+            </w:r>
+          </w:p>
+        </w:tc>
+        <w:tc>
+          <w:tcPr>
+            <w:tcW w:type="dxa" w:w="1100"/>
+            <w:tcMar>
+              <w:top w:type="dxa" w:w="60"/>
+              <w:left w:type="dxa" w:w="90"/>
+              <w:bottom w:type="dxa" w:w="60"/>
+              <w:right w:type="dxa" w:w="90"/>
+            </w:tcMar>
+          </w:tcPr>
+          <w:p>
+            <w:pPr>
+              <w:spacing w:after="40"/>
+            </w:pPr>
+            <w:r>
+              <w:rPr>
+                <w:b w:val="false"/>
+                <w:bCs w:val="false"/>
+                <w:sz w:val="20"/>
+                <w:szCs w:val="20"/>
+              </w:rPr>
+              <w:t xml:space="preserve">Talk</w:t>
+            </w:r>
+          </w:p>
+        </w:tc>
+        <w:tc>
+          <w:tcPr>
+            <w:tcW w:type="dxa" w:w="2900"/>
+            <w:tcMar>
+              <w:top w:type="dxa" w:w="60"/>
+              <w:left w:type="dxa" w:w="90"/>
+              <w:bottom w:type="dxa" w:w="60"/>
+              <w:right w:type="dxa" w:w="90"/>
+            </w:tcMar>
+          </w:tcPr>
+          <w:p>
+            <w:pPr>
+              <w:spacing w:after="40"/>
+            </w:pPr>
+            <w:r>
+              <w:rPr>
+                <w:b w:val="false"/>
+                <w:bCs w:val="false"/>
+                <w:sz w:val="18"/>
+                <w:szCs w:val="18"/>
+              </w:rPr>
+              <w:t xml:space="preserve">• Think: what comes next?</w:t>
+            </w:r>
+          </w:p>
+          <w:p>
+            <w:pPr>
+              <w:spacing w:after="40"/>
+            </w:pPr>
+            <w:r>
+              <w:rPr>
+                <w:b w:val="false"/>
+                <w:bCs w:val="false"/>
+                <w:sz w:val="18"/>
+                <w:szCs w:val="18"/>
+              </w:rPr>
+              <w:t xml:space="preserve">• Tell the teacher your vote</w:t>
+            </w:r>
+          </w:p>
+          <w:p>
+            <w:pPr>
+              <w:spacing w:after="40"/>
+            </w:pPr>
+            <w:r>
+              <w:rPr>
+                <w:b w:val="false"/>
+                <w:bCs w:val="false"/>
+                <w:sz w:val="18"/>
+                <w:szCs w:val="18"/>
+              </w:rPr>
+              <w:t xml:space="preserve">• Say: I think the next money will be …</w:t>
+            </w:r>
+          </w:p>
+          <w:p>
+            <w:pPr>
+              <w:spacing w:after="40"/>
+            </w:pPr>
+            <w:r>
+              <w:rPr>
+                <w:b w:val="false"/>
+                <w:bCs w:val="false"/>
+                <w:sz w:val="18"/>
+                <w:szCs w:val="18"/>
+              </w:rPr>
+              <w:t xml:space="preserve">Say: I think the next money will be … · I wish we used … because …</w:t>
+            </w:r>
+          </w:p>
+        </w:tc>
+        <w:tc>
+          <w:tcPr>
+            <w:tcW w:type="dxa" w:w="2160"/>
+            <w:tcMar>
+              <w:top w:type="dxa" w:w="60"/>
+              <w:left w:type="dxa" w:w="90"/>
+              <w:bottom w:type="dxa" w:w="60"/>
+              <w:right w:type="dxa" w:w="90"/>
+            </w:tcMar>
+          </w:tcPr>
+          <w:p>
+            <w:pPr>
+              <w:spacing w:after="40"/>
+            </w:pPr>
+            <w:r>
+              <w:rPr>
+                <w:b w:val="false"/>
+                <w:bCs w:val="false"/>
+                <w:sz w:val="17"/>
+                <w:szCs w:val="17"/>
+              </w:rPr>
+              <w:t xml:space="preserve">Book link: p.45 "What type of money do you think is going to be next?" and "Do you wish we used different money today?"</w:t>
+            </w:r>
+          </w:p>
+          <w:p>
+            <w:pPr>
+              <w:spacing w:after="40"/>
+            </w:pPr>
+            <w:r>
+              <w:rPr>
+                <w:b w:val="false"/>
+                <w:bCs w:val="false"/>
+                <w:sz w:val="17"/>
+                <w:szCs w:val="17"/>
+              </w:rPr>
+              <w:t xml:space="preserve">Tap the picture once for each pupil's vote. Ask two or three pupils to say why with "because". There is no wrong answer.</w:t>
+            </w:r>
+          </w:p>
+        </w:tc>
+      </w:tr>
+      <w:tr>
+        <w:trPr>
+          <w:cantSplit/>
+        </w:trPr>
+        <w:tc>
+          <w:tcPr>
+            <w:tcW w:type="dxa" w:w="500"/>
+            <w:tcMar>
+              <w:top w:type="dxa" w:w="60"/>
+              <w:left w:type="dxa" w:w="90"/>
+              <w:bottom w:type="dxa" w:w="60"/>
+              <w:right w:type="dxa" w:w="90"/>
+            </w:tcMar>
+          </w:tcPr>
+          <w:p>
+            <w:pPr>
+              <w:spacing w:after="40"/>
+            </w:pPr>
+            <w:r>
+              <w:rPr>
+                <w:b w:val="false"/>
+                <w:bCs w:val="false"/>
+                <w:sz w:val="20"/>
+                <w:szCs w:val="20"/>
+              </w:rPr>
+              <w:t xml:space="preserve">7</w:t>
+            </w:r>
+          </w:p>
+        </w:tc>
+        <w:tc>
+          <w:tcPr>
+            <w:tcW w:type="dxa" w:w="1900"/>
+            <w:tcMar>
+              <w:top w:type="dxa" w:w="60"/>
+              <w:left w:type="dxa" w:w="90"/>
+              <w:bottom w:type="dxa" w:w="60"/>
+              <w:right w:type="dxa" w:w="90"/>
+            </w:tcMar>
+          </w:tcPr>
+          <w:p>
+            <w:pPr>
+              <w:spacing w:after="40"/>
+            </w:pPr>
+            <w:r>
+              <w:rPr>
+                <w:b/>
+                <w:bCs/>
+                <w:sz w:val="20"/>
+                <w:szCs w:val="20"/>
+              </w:rPr>
+              <w:t xml:space="preserve">Time Travellers’ Ceremony</w:t>
+            </w:r>
+          </w:p>
+        </w:tc>
+        <w:tc>
+          <w:tcPr>
+            <w:tcW w:type="dxa" w:w="800"/>
+            <w:tcMar>
+              <w:top w:type="dxa" w:w="60"/>
+              <w:left w:type="dxa" w:w="90"/>
+              <w:bottom w:type="dxa" w:w="60"/>
+              <w:right w:type="dxa" w:w="90"/>
+            </w:tcMar>
+          </w:tcPr>
+          <w:p>
+            <w:pPr>
+              <w:spacing w:after="40"/>
+            </w:pPr>
+            <w:r>
+              <w:rPr>
+                <w:b w:val="false"/>
+                <w:bCs w:val="false"/>
+                <w:sz w:val="20"/>
+                <w:szCs w:val="20"/>
+              </w:rPr>
+              <w:t xml:space="preserve">3 min</w:t>
+            </w:r>
+          </w:p>
+        </w:tc>
+        <w:tc>
+          <w:tcPr>
+            <w:tcW w:type="dxa" w:w="1100"/>
+            <w:tcMar>
+              <w:top w:type="dxa" w:w="60"/>
+              <w:left w:type="dxa" w:w="90"/>
+              <w:bottom w:type="dxa" w:w="60"/>
+              <w:right w:type="dxa" w:w="90"/>
+            </w:tcMar>
+          </w:tcPr>
+          <w:p>
+            <w:pPr>
+              <w:spacing w:after="40"/>
+            </w:pPr>
+            <w:r>
+              <w:rPr>
+                <w:b w:val="false"/>
+                <w:bCs w:val="false"/>
+                <w:sz w:val="20"/>
+                <w:szCs w:val="20"/>
+              </w:rPr>
+              <w:t xml:space="preserve">Think</w:t>
+            </w:r>
+          </w:p>
+        </w:tc>
+        <w:tc>
+          <w:tcPr>
+            <w:tcW w:type="dxa" w:w="2900"/>
+            <w:tcMar>
+              <w:top w:type="dxa" w:w="60"/>
+              <w:left w:type="dxa" w:w="90"/>
+              <w:bottom w:type="dxa" w:w="60"/>
+              <w:right w:type="dxa" w:w="90"/>
+            </w:tcMar>
+          </w:tcPr>
+          <w:p>
+            <w:pPr>
+              <w:spacing w:after="40"/>
+            </w:pPr>
+            <w:r>
+              <w:rPr>
+                <w:b w:val="false"/>
+                <w:bCs w:val="false"/>
+                <w:sz w:val="18"/>
+                <w:szCs w:val="18"/>
+              </w:rPr>
+              <w:t xml:space="preserve">• Cheer for every team</w:t>
+            </w:r>
+          </w:p>
+          <w:p>
+            <w:pPr>
+              <w:spacing w:after="40"/>
+            </w:pPr>
+            <w:r>
+              <w:rPr>
+                <w:b w:val="false"/>
+                <w:bCs w:val="false"/>
+                <w:sz w:val="18"/>
+                <w:szCs w:val="18"/>
+              </w:rPr>
+              <w:t xml:space="preserve">• Door pass: the next type of money</w:t>
+            </w:r>
+          </w:p>
+          <w:p>
+            <w:pPr>
+              <w:spacing w:after="40"/>
+            </w:pPr>
+            <w:r>
+              <w:rPr>
+                <w:b w:val="false"/>
+                <w:bCs w:val="false"/>
+                <w:sz w:val="18"/>
+                <w:szCs w:val="18"/>
+              </w:rPr>
+              <w:t xml:space="preserve">Say: I think the next money will be …</w:t>
+            </w:r>
+          </w:p>
+        </w:tc>
+        <w:tc>
+          <w:tcPr>
+            <w:tcW w:type="dxa" w:w="2160"/>
+            <w:tcMar>
+              <w:top w:type="dxa" w:w="60"/>
+              <w:left w:type="dxa" w:w="90"/>
+              <w:bottom w:type="dxa" w:w="60"/>
+              <w:right w:type="dxa" w:w="90"/>
+            </w:tcMar>
+          </w:tcPr>
+          <w:p>
+            <w:pPr>
+              <w:spacing w:after="40"/>
+            </w:pPr>
+            <w:r>
+              <w:rPr>
+                <w:b w:val="false"/>
+                <w:bCs w:val="false"/>
+                <w:sz w:val="17"/>
+                <w:szCs w:val="17"/>
+              </w:rPr>
+              <w:t xml:space="preserve">At the door each pupil says one sentence: "I think the next money will be …". It checks the new language and gives you ideas for Lesson 4 (design the next money).</w:t>
+            </w:r>
+          </w:p>
+        </w:tc>
+      </w:tr>
+    </w:tbl>
+    <w:p>
+      <w:pPr>
+        <w:spacing w:before="140"/>
+      </w:pPr>
+    </w:p>
+    <w:p>
+      <w:pPr>
+        <w:spacing w:after="60"/>
+      </w:pPr>
+      <w:r>
+        <w:rPr>
+          <w:b/>
+          <w:bCs/>
+        </w:rPr>
+        <w:t xml:space="preserve">Support. </w:t>
+      </w:r>
+      <w:r>
+        <w:t xml:space="preserve">Use the picture and one word; the timeline strip helps; steal-the-question lets teams help each other.</w:t>
+      </w:r>
+    </w:p>
+    <w:p>
+      <w:pPr>
+        <w:spacing w:after="60"/>
+      </w:pPr>
+      <w:r>
+        <w:rPr>
+          <w:b/>
+          <w:bCs/>
+        </w:rPr>
+        <w:t xml:space="preserve">Stretch. </w:t>
+      </w:r>
+      <w:r>
+        <w:t xml:space="preserve">Add "because"; compare three kinds of money; say why people wanted something new.</w:t>
+      </w:r>
+    </w:p>
+    <w:p>
+      <w:pPr>
+        <w:spacing w:after="60"/>
+      </w:pPr>
+      <w:r>
+        <w:rPr>
+          <w:b/>
+          <w:bCs/>
+        </w:rPr>
+        <w:t xml:space="preserve">Check learning. </w:t>
+      </w:r>
+      <w:r>
+        <w:t xml:space="preserve">Door pass: "I think the next money will be …". Give a team point for every correct team, not only the fastest.</w:t>
+      </w:r>
+    </w:p>
+    <w:p>
+      <w:pPr>
+        <w:pStyle w:val="Heading1"/>
+        <w:pageBreakBefore/>
+      </w:pPr>
+      <w:r>
+        <w:t xml:space="preserve">Grade 3 · Unit 3 · How Much Is It? · Lesson 4: Design the Next Money</w:t>
+      </w:r>
+    </w:p>
+    <w:p>
+      <w:pPr>
+        <w:spacing w:after="100"/>
+      </w:pPr>
+      <w:r>
+        <w:rPr>
+          <w:color w:val="475569"/>
+          <w:sz w:val="20"/>
+          <w:szCs w:val="20"/>
+        </w:rPr>
+        <w:t xml:space="preserve">35 minutes · classes 3A and 3B · A1 · one smartboard + mini whiteboards · Open: unit3-g3-lessons/index.html?lesson=4</w:t>
+      </w:r>
+    </w:p>
+    <w:p>
+      <w:pPr>
+        <w:spacing w:after="60"/>
+      </w:pPr>
+      <w:r>
+        <w:rPr>
+          <w:b/>
+          <w:bCs/>
+        </w:rPr>
+        <w:t xml:space="preserve">Lesson goal. </w:t>
+      </w:r>
+      <w:r>
+        <w:t xml:space="preserve">Pupils say which things are or were money, complete the money chart, find a problem and its solution, and design the next type of money.</w:t>
+      </w:r>
+    </w:p>
+    <w:p>
+      <w:pPr>
+        <w:spacing w:after="60"/>
+      </w:pPr>
+      <w:r>
+        <w:rPr>
+          <w:b/>
+          <w:bCs/>
+        </w:rPr>
+        <w:t xml:space="preserve">Book link. </w:t>
+      </w:r>
+      <w:r>
+        <w:t xml:space="preserve">Book pp. 46-47 (Explore the Reading: Which of these is or was money? Compare and contrast the types of money. Design the next money; Identifying Problems and Solutions).</w:t>
+      </w:r>
+    </w:p>
+    <w:p>
+      <w:pPr>
+        <w:spacing w:after="60"/>
+      </w:pPr>
+      <w:r>
+        <w:rPr>
+          <w:b/>
+          <w:bCs/>
+        </w:rPr>
+        <w:t xml:space="preserve">Words. </w:t>
+      </w:r>
+      <w:r>
+        <w:t xml:space="preserve">problem, solution, metal, paper, plastic, shells, design</w:t>
+      </w:r>
+    </w:p>
+    <w:p>
+      <w:pPr>
+        <w:spacing w:after="60"/>
+      </w:pPr>
+      <w:r>
+        <w:rPr>
+          <w:b/>
+          <w:bCs/>
+        </w:rPr>
+        <w:t xml:space="preserve">Language. </w:t>
+      </w:r>
+      <w:r>
+        <w:t xml:space="preserve">Cowrie shells were used in 1200 BCE. · Credit cards are made from plastic. · The problem is … The solution is … · I think the next type of money will be a … You can … it.</w:t>
+      </w:r>
+    </w:p>
+    <w:p>
+      <w:pPr>
+        <w:spacing w:after="60"/>
+      </w:pPr>
+      <w:r>
+        <w:rPr>
+          <w:b/>
+          <w:bCs/>
+        </w:rPr>
+        <w:t xml:space="preserve">Prepare. </w:t>
+      </w:r>
+      <w:r>
+        <w:t xml:space="preserve">Print the Cards page: MONEY / NOT MONEY signs. Mini whiteboards and markers for each team (chart and design). One smartboard.</w:t>
+      </w:r>
+    </w:p>
+    <w:p>
+      <w:pPr>
+        <w:spacing w:before="120"/>
+      </w:pPr>
+    </w:p>
+    <w:tbl>
+      <w:tblPr>
+        <w:tblW w:type="dxa" w:w="9360"/>
+        <w:tblBorders>
+          <w:top w:val="single" w:color="94A3B8" w:sz="4"/>
+          <w:left w:val="single" w:color="94A3B8" w:sz="4"/>
+          <w:bottom w:val="single" w:color="94A3B8" w:sz="4"/>
+          <w:right w:val="single" w:color="94A3B8" w:sz="4"/>
+          <w:insideH w:val="single" w:color="94A3B8" w:sz="4"/>
+          <w:insideV w:val="single" w:color="94A3B8" w:sz="4"/>
+        </w:tblBorders>
+      </w:tblPr>
+      <w:tblGrid>
+        <w:gridCol w:w="500"/>
+        <w:gridCol w:w="1900"/>
+        <w:gridCol w:w="800"/>
+        <w:gridCol w:w="1100"/>
+        <w:gridCol w:w="2900"/>
+        <w:gridCol w:w="2160"/>
+      </w:tblGrid>
+      <w:tr>
+        <w:trPr>
+          <w:tblHeader/>
+        </w:trPr>
+        <w:tc>
+          <w:tcPr>
+            <w:tcW w:type="dxa" w:w="500"/>
+            <w:shd w:fill="E0F2FE" w:color="auto" w:val="clear"/>
+            <w:tcMar>
+              <w:top w:type="dxa" w:w="60"/>
+              <w:left w:type="dxa" w:w="90"/>
+              <w:bottom w:type="dxa" w:w="60"/>
+              <w:right w:type="dxa" w:w="90"/>
+            </w:tcMar>
+          </w:tcPr>
+          <w:p>
+            <w:pPr>
+              <w:spacing w:after="40"/>
+            </w:pPr>
+            <w:r>
+              <w:rPr>
+                <w:b/>
+                <w:bCs/>
+                <w:sz w:val="20"/>
+                <w:szCs w:val="20"/>
+              </w:rPr>
+              <w:t xml:space="preserve">#</w:t>
+            </w:r>
+          </w:p>
+        </w:tc>
+        <w:tc>
+          <w:tcPr>
+            <w:tcW w:type="dxa" w:w="1900"/>
+            <w:shd w:fill="E0F2FE" w:color="auto" w:val="clear"/>
+            <w:tcMar>
+              <w:top w:type="dxa" w:w="60"/>
+              <w:left w:type="dxa" w:w="90"/>
+              <w:bottom w:type="dxa" w:w="60"/>
+              <w:right w:type="dxa" w:w="90"/>
+            </w:tcMar>
+          </w:tcPr>
+          <w:p>
+            <w:pPr>
+              <w:spacing w:after="40"/>
+            </w:pPr>
+            <w:r>
+              <w:rPr>
+                <w:b/>
+                <w:bCs/>
+                <w:sz w:val="20"/>
+                <w:szCs w:val="20"/>
+              </w:rPr>
+              <w:t xml:space="preserve">Step</w:t>
+            </w:r>
+          </w:p>
+        </w:tc>
+        <w:tc>
+          <w:tcPr>
+            <w:tcW w:type="dxa" w:w="800"/>
+            <w:shd w:fill="E0F2FE" w:color="auto" w:val="clear"/>
+            <w:tcMar>
+              <w:top w:type="dxa" w:w="60"/>
+              <w:left w:type="dxa" w:w="90"/>
+              <w:bottom w:type="dxa" w:w="60"/>
+              <w:right w:type="dxa" w:w="90"/>
+            </w:tcMar>
+          </w:tcPr>
+          <w:p>
+            <w:pPr>
+              <w:spacing w:after="40"/>
+            </w:pPr>
+            <w:r>
+              <w:rPr>
+                <w:b/>
+                <w:bCs/>
+                <w:sz w:val="20"/>
+                <w:szCs w:val="20"/>
+              </w:rPr>
+              <w:t xml:space="preserve">Time</w:t>
+            </w:r>
+          </w:p>
+        </w:tc>
+        <w:tc>
+          <w:tcPr>
+            <w:tcW w:type="dxa" w:w="1100"/>
+            <w:shd w:fill="E0F2FE" w:color="auto" w:val="clear"/>
+            <w:tcMar>
+              <w:top w:type="dxa" w:w="60"/>
+              <w:left w:type="dxa" w:w="90"/>
+              <w:bottom w:type="dxa" w:w="60"/>
+              <w:right w:type="dxa" w:w="90"/>
+            </w:tcMar>
+          </w:tcPr>
+          <w:p>
+            <w:pPr>
+              <w:spacing w:after="40"/>
+            </w:pPr>
+            <w:r>
+              <w:rPr>
+                <w:b/>
+                <w:bCs/>
+                <w:sz w:val="20"/>
+                <w:szCs w:val="20"/>
+              </w:rPr>
+              <w:t xml:space="preserve">Mode</w:t>
+            </w:r>
+          </w:p>
+        </w:tc>
+        <w:tc>
+          <w:tcPr>
+            <w:tcW w:type="dxa" w:w="2900"/>
+            <w:shd w:fill="E0F2FE" w:color="auto" w:val="clear"/>
+            <w:tcMar>
+              <w:top w:type="dxa" w:w="60"/>
+              <w:left w:type="dxa" w:w="90"/>
+              <w:bottom w:type="dxa" w:w="60"/>
+              <w:right w:type="dxa" w:w="90"/>
+            </w:tcMar>
+          </w:tcPr>
+          <w:p>
+            <w:pPr>
+              <w:spacing w:after="40"/>
+            </w:pPr>
+            <w:r>
+              <w:rPr>
+                <w:b/>
+                <w:bCs/>
+                <w:sz w:val="20"/>
+                <w:szCs w:val="20"/>
+              </w:rPr>
+              <w:t xml:space="preserve">Pupils do</w:t>
+            </w:r>
+          </w:p>
+        </w:tc>
+        <w:tc>
+          <w:tcPr>
+            <w:tcW w:type="dxa" w:w="2160"/>
+            <w:shd w:fill="E0F2FE" w:color="auto" w:val="clear"/>
+            <w:tcMar>
+              <w:top w:type="dxa" w:w="60"/>
+              <w:left w:type="dxa" w:w="90"/>
+              <w:bottom w:type="dxa" w:w="60"/>
+              <w:right w:type="dxa" w:w="90"/>
+            </w:tcMar>
+          </w:tcPr>
+          <w:p>
+            <w:pPr>
+              <w:spacing w:after="40"/>
+            </w:pPr>
+            <w:r>
+              <w:rPr>
+                <w:b/>
+                <w:bCs/>
+                <w:sz w:val="20"/>
+                <w:szCs w:val="20"/>
+              </w:rPr>
+              <w:t xml:space="preserve">Teacher tips</w:t>
+            </w:r>
+          </w:p>
+        </w:tc>
+      </w:tr>
+      <w:tr>
+        <w:trPr>
+          <w:cantSplit/>
+        </w:trPr>
+        <w:tc>
+          <w:tcPr>
+            <w:tcW w:type="dxa" w:w="500"/>
+            <w:tcMar>
+              <w:top w:type="dxa" w:w="60"/>
+              <w:left w:type="dxa" w:w="90"/>
+              <w:bottom w:type="dxa" w:w="60"/>
+              <w:right w:type="dxa" w:w="90"/>
+            </w:tcMar>
+          </w:tcPr>
+          <w:p>
+            <w:pPr>
+              <w:spacing w:after="40"/>
+            </w:pPr>
+            <w:r>
+              <w:rPr>
+                <w:b w:val="false"/>
+                <w:bCs w:val="false"/>
+                <w:sz w:val="20"/>
+                <w:szCs w:val="20"/>
+              </w:rPr>
+              <w:t xml:space="preserve">1</w:t>
+            </w:r>
+          </w:p>
+        </w:tc>
+        <w:tc>
+          <w:tcPr>
+            <w:tcW w:type="dxa" w:w="1900"/>
+            <w:tcMar>
+              <w:top w:type="dxa" w:w="60"/>
+              <w:left w:type="dxa" w:w="90"/>
+              <w:bottom w:type="dxa" w:w="60"/>
+              <w:right w:type="dxa" w:w="90"/>
+            </w:tcMar>
+          </w:tcPr>
+          <w:p>
+            <w:pPr>
+              <w:spacing w:after="40"/>
+            </w:pPr>
+            <w:r>
+              <w:rPr>
+                <w:b/>
+                <w:bCs/>
+                <w:sz w:val="20"/>
+                <w:szCs w:val="20"/>
+              </w:rPr>
+              <w:t xml:space="preserve">Is It or Was It Money?</w:t>
+            </w:r>
+          </w:p>
+        </w:tc>
+        <w:tc>
+          <w:tcPr>
+            <w:tcW w:type="dxa" w:w="800"/>
+            <w:tcMar>
+              <w:top w:type="dxa" w:w="60"/>
+              <w:left w:type="dxa" w:w="90"/>
+              <w:bottom w:type="dxa" w:w="60"/>
+              <w:right w:type="dxa" w:w="90"/>
+            </w:tcMar>
+          </w:tcPr>
+          <w:p>
+            <w:pPr>
+              <w:spacing w:after="40"/>
+            </w:pPr>
+            <w:r>
+              <w:rPr>
+                <w:b w:val="false"/>
+                <w:bCs w:val="false"/>
+                <w:sz w:val="20"/>
+                <w:szCs w:val="20"/>
+              </w:rPr>
+              <w:t xml:space="preserve">4 min</w:t>
+            </w:r>
+          </w:p>
+        </w:tc>
+        <w:tc>
+          <w:tcPr>
+            <w:tcW w:type="dxa" w:w="1100"/>
+            <w:tcMar>
+              <w:top w:type="dxa" w:w="60"/>
+              <w:left w:type="dxa" w:w="90"/>
+              <w:bottom w:type="dxa" w:w="60"/>
+              <w:right w:type="dxa" w:w="90"/>
+            </w:tcMar>
+          </w:tcPr>
+          <w:p>
+            <w:pPr>
+              <w:spacing w:after="40"/>
+            </w:pPr>
+            <w:r>
+              <w:rPr>
+                <w:b w:val="false"/>
+                <w:bCs w:val="false"/>
+                <w:sz w:val="20"/>
+                <w:szCs w:val="20"/>
+              </w:rPr>
+              <w:t xml:space="preserve">Move</w:t>
+            </w:r>
+          </w:p>
+        </w:tc>
+        <w:tc>
+          <w:tcPr>
+            <w:tcW w:type="dxa" w:w="2900"/>
+            <w:tcMar>
+              <w:top w:type="dxa" w:w="60"/>
+              <w:left w:type="dxa" w:w="90"/>
+              <w:bottom w:type="dxa" w:w="60"/>
+              <w:right w:type="dxa" w:w="90"/>
+            </w:tcMar>
+          </w:tcPr>
+          <w:p>
+            <w:pPr>
+              <w:spacing w:after="40"/>
+            </w:pPr>
+            <w:r>
+              <w:rPr>
+                <w:b w:val="false"/>
+                <w:bCs w:val="false"/>
+                <w:sz w:val="18"/>
+                <w:szCs w:val="18"/>
+              </w:rPr>
+              <w:t xml:space="preserve">• Read the card</w:t>
+            </w:r>
+          </w:p>
+          <w:p>
+            <w:pPr>
+              <w:spacing w:after="40"/>
+            </w:pPr>
+            <w:r>
+              <w:rPr>
+                <w:b w:val="false"/>
+                <w:bCs w:val="false"/>
+                <w:sz w:val="18"/>
+                <w:szCs w:val="18"/>
+              </w:rPr>
+              <w:t xml:space="preserve">• Walk to MONEY or NOT MONEY</w:t>
+            </w:r>
+          </w:p>
+          <w:p>
+            <w:pPr>
+              <w:spacing w:after="40"/>
+            </w:pPr>
+            <w:r>
+              <w:rPr>
+                <w:b w:val="false"/>
+                <w:bCs w:val="false"/>
+                <w:sz w:val="18"/>
+                <w:szCs w:val="18"/>
+              </w:rPr>
+              <w:t xml:space="preserve">• Say the sentence</w:t>
+            </w:r>
+          </w:p>
+          <w:p>
+            <w:pPr>
+              <w:spacing w:after="40"/>
+            </w:pPr>
+            <w:r>
+              <w:rPr>
+                <w:b w:val="false"/>
+                <w:bCs w:val="false"/>
+                <w:sz w:val="18"/>
+                <w:szCs w:val="18"/>
+              </w:rPr>
+              <w:t xml:space="preserve">Say: … was money. · … is not money.</w:t>
+            </w:r>
+          </w:p>
+        </w:tc>
+        <w:tc>
+          <w:tcPr>
+            <w:tcW w:type="dxa" w:w="2160"/>
+            <w:tcMar>
+              <w:top w:type="dxa" w:w="60"/>
+              <w:left w:type="dxa" w:w="90"/>
+              <w:bottom w:type="dxa" w:w="60"/>
+              <w:right w:type="dxa" w:w="90"/>
+            </w:tcMar>
+          </w:tcPr>
+          <w:p>
+            <w:pPr>
+              <w:spacing w:after="40"/>
+            </w:pPr>
+            <w:r>
+              <w:rPr>
+                <w:b w:val="false"/>
+                <w:bCs w:val="false"/>
+                <w:sz w:val="17"/>
+                <w:szCs w:val="17"/>
+              </w:rPr>
+              <w:t xml:space="preserve">Book link: p.46 A "Think and check. Which of these is or was money?" (cowrie shells, a fork and knife, an ancient Chinese knife, a wallet, paper money, a credit card). Answers: the shells, the Chinese knife, paper money and the credit card are or were money.</w:t>
+            </w:r>
+          </w:p>
+          <w:p>
+            <w:pPr>
+              <w:spacing w:after="40"/>
+            </w:pPr>
+            <w:r>
+              <w:rPr>
+                <w:b w:val="false"/>
+                <w:bCs w:val="false"/>
+                <w:sz w:val="17"/>
+                <w:szCs w:val="17"/>
+              </w:rPr>
+              <w:t xml:space="preserve">Print the two corner signs from the Cards page. Pupils walk, then say the sentence. A wallet holds money but is not money.</w:t>
+            </w:r>
+          </w:p>
+        </w:tc>
+      </w:tr>
+      <w:tr>
+        <w:trPr>
+          <w:cantSplit/>
+        </w:trPr>
+        <w:tc>
+          <w:tcPr>
+            <w:tcW w:type="dxa" w:w="500"/>
+            <w:tcMar>
+              <w:top w:type="dxa" w:w="60"/>
+              <w:left w:type="dxa" w:w="90"/>
+              <w:bottom w:type="dxa" w:w="60"/>
+              <w:right w:type="dxa" w:w="90"/>
+            </w:tcMar>
+          </w:tcPr>
+          <w:p>
+            <w:pPr>
+              <w:spacing w:after="40"/>
+            </w:pPr>
+            <w:r>
+              <w:rPr>
+                <w:b w:val="false"/>
+                <w:bCs w:val="false"/>
+                <w:sz w:val="20"/>
+                <w:szCs w:val="20"/>
+              </w:rPr>
+              <w:t xml:space="preserve">2</w:t>
+            </w:r>
+          </w:p>
+        </w:tc>
+        <w:tc>
+          <w:tcPr>
+            <w:tcW w:type="dxa" w:w="1900"/>
+            <w:tcMar>
+              <w:top w:type="dxa" w:w="60"/>
+              <w:left w:type="dxa" w:w="90"/>
+              <w:bottom w:type="dxa" w:w="60"/>
+              <w:right w:type="dxa" w:w="90"/>
+            </w:tcMar>
+          </w:tcPr>
+          <w:p>
+            <w:pPr>
+              <w:spacing w:after="40"/>
+            </w:pPr>
+            <w:r>
+              <w:rPr>
+                <w:b/>
+                <w:bCs/>
+                <w:sz w:val="20"/>
+                <w:szCs w:val="20"/>
+              </w:rPr>
+              <w:t xml:space="preserve">The Money Chart</w:t>
+            </w:r>
+          </w:p>
+        </w:tc>
+        <w:tc>
+          <w:tcPr>
+            <w:tcW w:type="dxa" w:w="800"/>
+            <w:tcMar>
+              <w:top w:type="dxa" w:w="60"/>
+              <w:left w:type="dxa" w:w="90"/>
+              <w:bottom w:type="dxa" w:w="60"/>
+              <w:right w:type="dxa" w:w="90"/>
+            </w:tcMar>
+          </w:tcPr>
+          <w:p>
+            <w:pPr>
+              <w:spacing w:after="40"/>
+            </w:pPr>
+            <w:r>
+              <w:rPr>
+                <w:b w:val="false"/>
+                <w:bCs w:val="false"/>
+                <w:sz w:val="20"/>
+                <w:szCs w:val="20"/>
+              </w:rPr>
+              <w:t xml:space="preserve">5 min</w:t>
+            </w:r>
+          </w:p>
+        </w:tc>
+        <w:tc>
+          <w:tcPr>
+            <w:tcW w:type="dxa" w:w="1100"/>
+            <w:tcMar>
+              <w:top w:type="dxa" w:w="60"/>
+              <w:left w:type="dxa" w:w="90"/>
+              <w:bottom w:type="dxa" w:w="60"/>
+              <w:right w:type="dxa" w:w="90"/>
+            </w:tcMar>
+          </w:tcPr>
+          <w:p>
+            <w:pPr>
+              <w:spacing w:after="40"/>
+            </w:pPr>
+            <w:r>
+              <w:rPr>
+                <w:b w:val="false"/>
+                <w:bCs w:val="false"/>
+                <w:sz w:val="20"/>
+                <w:szCs w:val="20"/>
+              </w:rPr>
+              <w:t xml:space="preserve">Think</w:t>
+            </w:r>
+          </w:p>
+        </w:tc>
+        <w:tc>
+          <w:tcPr>
+            <w:tcW w:type="dxa" w:w="2900"/>
+            <w:tcMar>
+              <w:top w:type="dxa" w:w="60"/>
+              <w:left w:type="dxa" w:w="90"/>
+              <w:bottom w:type="dxa" w:w="60"/>
+              <w:right w:type="dxa" w:w="90"/>
+            </w:tcMar>
+          </w:tcPr>
+          <w:p>
+            <w:pPr>
+              <w:spacing w:after="40"/>
+            </w:pPr>
+            <w:r>
+              <w:rPr>
+                <w:b w:val="false"/>
+                <w:bCs w:val="false"/>
+                <w:sz w:val="18"/>
+                <w:szCs w:val="18"/>
+              </w:rPr>
+              <w:t xml:space="preserve">• Talk with your team</w:t>
+            </w:r>
+          </w:p>
+          <w:p>
+            <w:pPr>
+              <w:spacing w:after="40"/>
+            </w:pPr>
+            <w:r>
+              <w:rPr>
+                <w:b w:val="false"/>
+                <w:bCs w:val="false"/>
+                <w:sz w:val="18"/>
+                <w:szCs w:val="18"/>
+              </w:rPr>
+              <w:t xml:space="preserve">• Fill the chart on the mini whiteboard</w:t>
+            </w:r>
+          </w:p>
+          <w:p>
+            <w:pPr>
+              <w:spacing w:after="40"/>
+            </w:pPr>
+            <w:r>
+              <w:rPr>
+                <w:b w:val="false"/>
+                <w:bCs w:val="false"/>
+                <w:sz w:val="18"/>
+                <w:szCs w:val="18"/>
+              </w:rPr>
+              <w:t xml:space="preserve">• Check: the teacher taps a cell</w:t>
+            </w:r>
+          </w:p>
+          <w:p>
+            <w:pPr>
+              <w:spacing w:after="40"/>
+            </w:pPr>
+            <w:r>
+              <w:rPr>
+                <w:b w:val="false"/>
+                <w:bCs w:val="false"/>
+                <w:sz w:val="18"/>
+                <w:szCs w:val="18"/>
+              </w:rPr>
+              <w:t xml:space="preserve">Say: … was used in … · … was made from …</w:t>
+            </w:r>
+          </w:p>
+        </w:tc>
+        <w:tc>
+          <w:tcPr>
+            <w:tcW w:type="dxa" w:w="2160"/>
+            <w:tcMar>
+              <w:top w:type="dxa" w:w="60"/>
+              <w:left w:type="dxa" w:w="90"/>
+              <w:bottom w:type="dxa" w:w="60"/>
+              <w:right w:type="dxa" w:w="90"/>
+            </w:tcMar>
+          </w:tcPr>
+          <w:p>
+            <w:pPr>
+              <w:spacing w:after="40"/>
+            </w:pPr>
+            <w:r>
+              <w:rPr>
+                <w:b w:val="false"/>
+                <w:bCs w:val="false"/>
+                <w:sz w:val="17"/>
+                <w:szCs w:val="17"/>
+              </w:rPr>
+              <w:t xml:space="preserve">Book link: p.46 B "Compare and contrast the types of money. Complete the chart." (Type of Money / When It Was Used / What It Was Made From).</w:t>
+            </w:r>
+          </w:p>
+          <w:p>
+            <w:pPr>
+              <w:spacing w:after="40"/>
+            </w:pPr>
+            <w:r>
+              <w:rPr>
+                <w:b w:val="false"/>
+                <w:bCs w:val="false"/>
+                <w:sz w:val="17"/>
+                <w:szCs w:val="17"/>
+              </w:rPr>
+              <w:t xml:space="preserve">Teams draw the chart on mini whiteboards and fill it in from what they know. Tap each cell to check (or Show all answers).</w:t>
+            </w:r>
+          </w:p>
+          <w:p>
+            <w:pPr>
+              <w:spacing w:after="40"/>
+            </w:pPr>
+            <w:r>
+              <w:rPr>
+                <w:b w:val="false"/>
+                <w:bCs w:val="false"/>
+                <w:sz w:val="17"/>
+                <w:szCs w:val="17"/>
+              </w:rPr>
+              <w:t xml:space="preserve">Answers: cowrie shells 1200 BCE shells; knives and spades 1000 BCE metal; paper money 800-900 CE paper; credit card 1958 plastic.</w:t>
+            </w:r>
+          </w:p>
+        </w:tc>
+      </w:tr>
+      <w:tr>
+        <w:trPr>
+          <w:cantSplit/>
+        </w:trPr>
+        <w:tc>
+          <w:tcPr>
+            <w:tcW w:type="dxa" w:w="500"/>
+            <w:tcMar>
+              <w:top w:type="dxa" w:w="60"/>
+              <w:left w:type="dxa" w:w="90"/>
+              <w:bottom w:type="dxa" w:w="60"/>
+              <w:right w:type="dxa" w:w="90"/>
+            </w:tcMar>
+          </w:tcPr>
+          <w:p>
+            <w:pPr>
+              <w:spacing w:after="40"/>
+            </w:pPr>
+            <w:r>
+              <w:rPr>
+                <w:b w:val="false"/>
+                <w:bCs w:val="false"/>
+                <w:sz w:val="20"/>
+                <w:szCs w:val="20"/>
+              </w:rPr>
+              <w:t xml:space="preserve">3</w:t>
+            </w:r>
+          </w:p>
+        </w:tc>
+        <w:tc>
+          <w:tcPr>
+            <w:tcW w:type="dxa" w:w="1900"/>
+            <w:tcMar>
+              <w:top w:type="dxa" w:w="60"/>
+              <w:left w:type="dxa" w:w="90"/>
+              <w:bottom w:type="dxa" w:w="60"/>
+              <w:right w:type="dxa" w:w="90"/>
+            </w:tcMar>
+          </w:tcPr>
+          <w:p>
+            <w:pPr>
+              <w:spacing w:after="40"/>
+            </w:pPr>
+            <w:r>
+              <w:rPr>
+                <w:b/>
+                <w:bCs/>
+                <w:sz w:val="20"/>
+                <w:szCs w:val="20"/>
+              </w:rPr>
+              <w:t xml:space="preserve">A Problem and a Solution</w:t>
+            </w:r>
+          </w:p>
+        </w:tc>
+        <w:tc>
+          <w:tcPr>
+            <w:tcW w:type="dxa" w:w="800"/>
+            <w:tcMar>
+              <w:top w:type="dxa" w:w="60"/>
+              <w:left w:type="dxa" w:w="90"/>
+              <w:bottom w:type="dxa" w:w="60"/>
+              <w:right w:type="dxa" w:w="90"/>
+            </w:tcMar>
+          </w:tcPr>
+          <w:p>
+            <w:pPr>
+              <w:spacing w:after="40"/>
+            </w:pPr>
+            <w:r>
+              <w:rPr>
+                <w:b w:val="false"/>
+                <w:bCs w:val="false"/>
+                <w:sz w:val="20"/>
+                <w:szCs w:val="20"/>
+              </w:rPr>
+              <w:t xml:space="preserve">6 min</w:t>
+            </w:r>
+          </w:p>
+        </w:tc>
+        <w:tc>
+          <w:tcPr>
+            <w:tcW w:type="dxa" w:w="1100"/>
+            <w:tcMar>
+              <w:top w:type="dxa" w:w="60"/>
+              <w:left w:type="dxa" w:w="90"/>
+              <w:bottom w:type="dxa" w:w="60"/>
+              <w:right w:type="dxa" w:w="90"/>
+            </w:tcMar>
+          </w:tcPr>
+          <w:p>
+            <w:pPr>
+              <w:spacing w:after="40"/>
+            </w:pPr>
+            <w:r>
+              <w:rPr>
+                <w:b w:val="false"/>
+                <w:bCs w:val="false"/>
+                <w:sz w:val="20"/>
+                <w:szCs w:val="20"/>
+              </w:rPr>
+              <w:t xml:space="preserve">Act it out</w:t>
+            </w:r>
+          </w:p>
+        </w:tc>
+        <w:tc>
+          <w:tcPr>
+            <w:tcW w:type="dxa" w:w="2900"/>
+            <w:tcMar>
+              <w:top w:type="dxa" w:w="60"/>
+              <w:left w:type="dxa" w:w="90"/>
+              <w:bottom w:type="dxa" w:w="60"/>
+              <w:right w:type="dxa" w:w="90"/>
+            </w:tcMar>
+          </w:tcPr>
+          <w:p>
+            <w:pPr>
+              <w:spacing w:after="40"/>
+            </w:pPr>
+            <w:r>
+              <w:rPr>
+                <w:b w:val="false"/>
+                <w:bCs w:val="false"/>
+                <w:sz w:val="18"/>
+                <w:szCs w:val="18"/>
+              </w:rPr>
+              <w:t xml:space="preserve">• Stand up and do the action</w:t>
+            </w:r>
+          </w:p>
+          <w:p>
+            <w:pPr>
+              <w:spacing w:after="40"/>
+            </w:pPr>
+            <w:r>
+              <w:rPr>
+                <w:b w:val="false"/>
+                <w:bCs w:val="false"/>
+                <w:sz w:val="18"/>
+                <w:szCs w:val="18"/>
+              </w:rPr>
+              <w:t xml:space="preserve">• At the 🤔 part: find the problem</w:t>
+            </w:r>
+          </w:p>
+          <w:p>
+            <w:pPr>
+              <w:spacing w:after="40"/>
+            </w:pPr>
+            <w:r>
+              <w:rPr>
+                <w:b w:val="false"/>
+                <w:bCs w:val="false"/>
+                <w:sz w:val="18"/>
+                <w:szCs w:val="18"/>
+              </w:rPr>
+              <w:t xml:space="preserve">• Say: The problem is … The solution is …</w:t>
+            </w:r>
+          </w:p>
+          <w:p>
+            <w:pPr>
+              <w:spacing w:after="40"/>
+            </w:pPr>
+            <w:r>
+              <w:rPr>
+                <w:b w:val="false"/>
+                <w:bCs w:val="false"/>
+                <w:sz w:val="18"/>
+                <w:szCs w:val="18"/>
+              </w:rPr>
+              <w:t xml:space="preserve">Say: The problem is … · The solution is …</w:t>
+            </w:r>
+          </w:p>
+        </w:tc>
+        <w:tc>
+          <w:tcPr>
+            <w:tcW w:type="dxa" w:w="2160"/>
+            <w:tcMar>
+              <w:top w:type="dxa" w:w="60"/>
+              <w:left w:type="dxa" w:w="90"/>
+              <w:bottom w:type="dxa" w:w="60"/>
+              <w:right w:type="dxa" w:w="90"/>
+            </w:tcMar>
+          </w:tcPr>
+          <w:p>
+            <w:pPr>
+              <w:spacing w:after="40"/>
+            </w:pPr>
+            <w:r>
+              <w:rPr>
+                <w:b w:val="false"/>
+                <w:bCs w:val="false"/>
+                <w:sz w:val="17"/>
+                <w:szCs w:val="17"/>
+              </w:rPr>
+              <w:t xml:space="preserve">Book link: p.47 "Identifying Problems and Solutions" (the retelling of A New Friend: Go Ne, his father, Wen Shu, the slingshot, the vet). "A problem is something difficult that happens in stories and in our lives. We can fix problems. A solution is a way to fix the problem."</w:t>
+            </w:r>
+          </w:p>
+          <w:p>
+            <w:pPr>
+              <w:spacing w:after="40"/>
+            </w:pPr>
+            <w:r>
+              <w:rPr>
+                <w:b w:val="false"/>
+                <w:bCs w:val="false"/>
+                <w:sz w:val="17"/>
+                <w:szCs w:val="17"/>
+              </w:rPr>
+              <w:t xml:space="preserve">The story is retold in simple words. Pupils then do p.47 A in their books (write the problem and the solution).</w:t>
+            </w:r>
+          </w:p>
+        </w:tc>
+      </w:tr>
+      <w:tr>
+        <w:trPr>
+          <w:cantSplit/>
+        </w:trPr>
+        <w:tc>
+          <w:tcPr>
+            <w:tcW w:type="dxa" w:w="500"/>
+            <w:tcMar>
+              <w:top w:type="dxa" w:w="60"/>
+              <w:left w:type="dxa" w:w="90"/>
+              <w:bottom w:type="dxa" w:w="60"/>
+              <w:right w:type="dxa" w:w="90"/>
+            </w:tcMar>
+          </w:tcPr>
+          <w:p>
+            <w:pPr>
+              <w:spacing w:after="40"/>
+            </w:pPr>
+            <w:r>
+              <w:rPr>
+                <w:b w:val="false"/>
+                <w:bCs w:val="false"/>
+                <w:sz w:val="20"/>
+                <w:szCs w:val="20"/>
+              </w:rPr>
+              <w:t xml:space="preserve">4</w:t>
+            </w:r>
+          </w:p>
+        </w:tc>
+        <w:tc>
+          <w:tcPr>
+            <w:tcW w:type="dxa" w:w="1900"/>
+            <w:tcMar>
+              <w:top w:type="dxa" w:w="60"/>
+              <w:left w:type="dxa" w:w="90"/>
+              <w:bottom w:type="dxa" w:w="60"/>
+              <w:right w:type="dxa" w:w="90"/>
+            </w:tcMar>
+          </w:tcPr>
+          <w:p>
+            <w:pPr>
+              <w:spacing w:after="40"/>
+            </w:pPr>
+            <w:r>
+              <w:rPr>
+                <w:b/>
+                <w:bCs/>
+                <w:sz w:val="20"/>
+                <w:szCs w:val="20"/>
+              </w:rPr>
+              <w:t xml:space="preserve">GAME: Problem and Solution Pairs</w:t>
+            </w:r>
+          </w:p>
+        </w:tc>
+        <w:tc>
+          <w:tcPr>
+            <w:tcW w:type="dxa" w:w="800"/>
+            <w:tcMar>
+              <w:top w:type="dxa" w:w="60"/>
+              <w:left w:type="dxa" w:w="90"/>
+              <w:bottom w:type="dxa" w:w="60"/>
+              <w:right w:type="dxa" w:w="90"/>
+            </w:tcMar>
+          </w:tcPr>
+          <w:p>
+            <w:pPr>
+              <w:spacing w:after="40"/>
+            </w:pPr>
+            <w:r>
+              <w:rPr>
+                <w:b w:val="false"/>
+                <w:bCs w:val="false"/>
+                <w:sz w:val="20"/>
+                <w:szCs w:val="20"/>
+              </w:rPr>
+              <w:t xml:space="preserve">9 min</w:t>
+            </w:r>
+          </w:p>
+        </w:tc>
+        <w:tc>
+          <w:tcPr>
+            <w:tcW w:type="dxa" w:w="1100"/>
+            <w:tcMar>
+              <w:top w:type="dxa" w:w="60"/>
+              <w:left w:type="dxa" w:w="90"/>
+              <w:bottom w:type="dxa" w:w="60"/>
+              <w:right w:type="dxa" w:w="90"/>
+            </w:tcMar>
+          </w:tcPr>
+          <w:p>
+            <w:pPr>
+              <w:spacing w:after="40"/>
+            </w:pPr>
+            <w:r>
+              <w:rPr>
+                <w:b w:val="false"/>
+                <w:bCs w:val="false"/>
+                <w:sz w:val="20"/>
+                <w:szCs w:val="20"/>
+              </w:rPr>
+              <w:t xml:space="preserve">Game</w:t>
+            </w:r>
+          </w:p>
+        </w:tc>
+        <w:tc>
+          <w:tcPr>
+            <w:tcW w:type="dxa" w:w="2900"/>
+            <w:tcMar>
+              <w:top w:type="dxa" w:w="60"/>
+              <w:left w:type="dxa" w:w="90"/>
+              <w:bottom w:type="dxa" w:w="60"/>
+              <w:right w:type="dxa" w:w="90"/>
+            </w:tcMar>
+          </w:tcPr>
+          <w:p>
+            <w:pPr>
+              <w:spacing w:after="40"/>
+            </w:pPr>
+            <w:r>
+              <w:rPr>
+                <w:b w:val="false"/>
+                <w:bCs w:val="false"/>
+                <w:sz w:val="18"/>
+                <w:szCs w:val="18"/>
+              </w:rPr>
+              <w:t xml:space="preserve">• Flip two cards</w:t>
+            </w:r>
+          </w:p>
+          <w:p>
+            <w:pPr>
+              <w:spacing w:after="40"/>
+            </w:pPr>
+            <w:r>
+              <w:rPr>
+                <w:b w:val="false"/>
+                <w:bCs w:val="false"/>
+                <w:sz w:val="18"/>
+                <w:szCs w:val="18"/>
+              </w:rPr>
+              <w:t xml:space="preserve">• Read the card out loud</w:t>
+            </w:r>
+          </w:p>
+          <w:p>
+            <w:pPr>
+              <w:spacing w:after="40"/>
+            </w:pPr>
+            <w:r>
+              <w:rPr>
+                <w:b w:val="false"/>
+                <w:bCs w:val="false"/>
+                <w:sz w:val="18"/>
+                <w:szCs w:val="18"/>
+              </w:rPr>
+              <w:t xml:space="preserve">• Match the problem and its solution</w:t>
+            </w:r>
+          </w:p>
+          <w:p>
+            <w:pPr>
+              <w:spacing w:after="40"/>
+            </w:pPr>
+            <w:r>
+              <w:rPr>
+                <w:b w:val="false"/>
+                <w:bCs w:val="false"/>
+                <w:sz w:val="18"/>
+                <w:szCs w:val="18"/>
+              </w:rPr>
+              <w:t xml:space="preserve">Say: This is a problem. · This is the solution.</w:t>
+            </w:r>
+          </w:p>
+        </w:tc>
+        <w:tc>
+          <w:tcPr>
+            <w:tcW w:type="dxa" w:w="2160"/>
+            <w:tcMar>
+              <w:top w:type="dxa" w:w="60"/>
+              <w:left w:type="dxa" w:w="90"/>
+              <w:bottom w:type="dxa" w:w="60"/>
+              <w:right w:type="dxa" w:w="90"/>
+            </w:tcMar>
+          </w:tcPr>
+          <w:p>
+            <w:pPr>
+              <w:spacing w:after="40"/>
+            </w:pPr>
+            <w:r>
+              <w:rPr>
+                <w:b w:val="false"/>
+                <w:bCs w:val="false"/>
+                <w:sz w:val="17"/>
+                <w:szCs w:val="17"/>
+              </w:rPr>
+              <w:t xml:space="preserve">Book link: p.47 B "Look at these pictures of early money. What were the problems with them? What solutions did people use?" (barter, metal spade money) and pp.42-45.</w:t>
+            </w:r>
+          </w:p>
+          <w:p>
+            <w:pPr>
+              <w:spacing w:after="40"/>
+            </w:pPr>
+            <w:r>
+              <w:rPr>
+                <w:b w:val="false"/>
+                <w:bCs w:val="false"/>
+                <w:sz w:val="17"/>
+                <w:szCs w:val="17"/>
+              </w:rPr>
+              <w:t xml:space="preserve">The team in turn chooses two cards (the whole team shouts a number, one pupil taps). The board reads each card. A pair = 2 points and the team goes again. A wrong pair turns back and the next team plays.</w:t>
+            </w:r>
+          </w:p>
+          <w:p>
+            <w:pPr>
+              <w:spacing w:after="40"/>
+            </w:pPr>
+            <w:r>
+              <w:rPr>
+                <w:b w:val="false"/>
+                <w:bCs w:val="false"/>
+                <w:sz w:val="17"/>
+                <w:szCs w:val="17"/>
+              </w:rPr>
+              <w:t xml:space="preserve">Six pairs on the board. When all are found the winner is shown.</w:t>
+            </w:r>
+          </w:p>
+        </w:tc>
+      </w:tr>
+      <w:tr>
+        <w:trPr>
+          <w:cantSplit/>
+        </w:trPr>
+        <w:tc>
+          <w:tcPr>
+            <w:tcW w:type="dxa" w:w="500"/>
+            <w:tcMar>
+              <w:top w:type="dxa" w:w="60"/>
+              <w:left w:type="dxa" w:w="90"/>
+              <w:bottom w:type="dxa" w:w="60"/>
+              <w:right w:type="dxa" w:w="90"/>
+            </w:tcMar>
+          </w:tcPr>
+          <w:p>
+            <w:pPr>
+              <w:spacing w:after="40"/>
+            </w:pPr>
+            <w:r>
+              <w:rPr>
+                <w:b w:val="false"/>
+                <w:bCs w:val="false"/>
+                <w:sz w:val="20"/>
+                <w:szCs w:val="20"/>
+              </w:rPr>
+              <w:t xml:space="preserve">5</w:t>
+            </w:r>
+          </w:p>
+        </w:tc>
+        <w:tc>
+          <w:tcPr>
+            <w:tcW w:type="dxa" w:w="1900"/>
+            <w:tcMar>
+              <w:top w:type="dxa" w:w="60"/>
+              <w:left w:type="dxa" w:w="90"/>
+              <w:bottom w:type="dxa" w:w="60"/>
+              <w:right w:type="dxa" w:w="90"/>
+            </w:tcMar>
+          </w:tcPr>
+          <w:p>
+            <w:pPr>
+              <w:spacing w:after="40"/>
+            </w:pPr>
+            <w:r>
+              <w:rPr>
+                <w:b/>
+                <w:bCs/>
+                <w:sz w:val="20"/>
+                <w:szCs w:val="20"/>
+              </w:rPr>
+              <w:t xml:space="preserve">Design the Next Money</w:t>
+            </w:r>
+          </w:p>
+        </w:tc>
+        <w:tc>
+          <w:tcPr>
+            <w:tcW w:type="dxa" w:w="800"/>
+            <w:tcMar>
+              <w:top w:type="dxa" w:w="60"/>
+              <w:left w:type="dxa" w:w="90"/>
+              <w:bottom w:type="dxa" w:w="60"/>
+              <w:right w:type="dxa" w:w="90"/>
+            </w:tcMar>
+          </w:tcPr>
+          <w:p>
+            <w:pPr>
+              <w:spacing w:after="40"/>
+            </w:pPr>
+            <w:r>
+              <w:rPr>
+                <w:b w:val="false"/>
+                <w:bCs w:val="false"/>
+                <w:sz w:val="20"/>
+                <w:szCs w:val="20"/>
+              </w:rPr>
+              <w:t xml:space="preserve">8 min</w:t>
+            </w:r>
+          </w:p>
+        </w:tc>
+        <w:tc>
+          <w:tcPr>
+            <w:tcW w:type="dxa" w:w="1100"/>
+            <w:tcMar>
+              <w:top w:type="dxa" w:w="60"/>
+              <w:left w:type="dxa" w:w="90"/>
+              <w:bottom w:type="dxa" w:w="60"/>
+              <w:right w:type="dxa" w:w="90"/>
+            </w:tcMar>
+          </w:tcPr>
+          <w:p>
+            <w:pPr>
+              <w:spacing w:after="40"/>
+            </w:pPr>
+            <w:r>
+              <w:rPr>
+                <w:b w:val="false"/>
+                <w:bCs w:val="false"/>
+                <w:sz w:val="20"/>
+                <w:szCs w:val="20"/>
+              </w:rPr>
+              <w:t xml:space="preserve">Create</w:t>
+            </w:r>
+          </w:p>
+        </w:tc>
+        <w:tc>
+          <w:tcPr>
+            <w:tcW w:type="dxa" w:w="2900"/>
+            <w:tcMar>
+              <w:top w:type="dxa" w:w="60"/>
+              <w:left w:type="dxa" w:w="90"/>
+              <w:bottom w:type="dxa" w:w="60"/>
+              <w:right w:type="dxa" w:w="90"/>
+            </w:tcMar>
+          </w:tcPr>
+          <w:p>
+            <w:pPr>
+              <w:spacing w:after="40"/>
+            </w:pPr>
+            <w:r>
+              <w:rPr>
+                <w:b w:val="false"/>
+                <w:bCs w:val="false"/>
+                <w:sz w:val="18"/>
+                <w:szCs w:val="18"/>
+              </w:rPr>
+              <w:t xml:space="preserve">• Spin the Money Machine for an idea</w:t>
+            </w:r>
+          </w:p>
+          <w:p>
+            <w:pPr>
+              <w:spacing w:after="40"/>
+            </w:pPr>
+            <w:r>
+              <w:rPr>
+                <w:b w:val="false"/>
+                <w:bCs w:val="false"/>
+                <w:sz w:val="18"/>
+                <w:szCs w:val="18"/>
+              </w:rPr>
+              <w:t xml:space="preserve">• Draw your money on the mini whiteboard</w:t>
+            </w:r>
+          </w:p>
+          <w:p>
+            <w:pPr>
+              <w:spacing w:after="40"/>
+            </w:pPr>
+            <w:r>
+              <w:rPr>
+                <w:b w:val="false"/>
+                <w:bCs w:val="false"/>
+                <w:sz w:val="18"/>
+                <w:szCs w:val="18"/>
+              </w:rPr>
+              <w:t xml:space="preserve">• Show it: I think the next type of money will be …</w:t>
+            </w:r>
+          </w:p>
+          <w:p>
+            <w:pPr>
+              <w:spacing w:after="40"/>
+            </w:pPr>
+            <w:r>
+              <w:rPr>
+                <w:b w:val="false"/>
+                <w:bCs w:val="false"/>
+                <w:sz w:val="18"/>
+                <w:szCs w:val="18"/>
+              </w:rPr>
+              <w:t xml:space="preserve">Say: I think the next type of money will be a … · You can … it.</w:t>
+            </w:r>
+          </w:p>
+        </w:tc>
+        <w:tc>
+          <w:tcPr>
+            <w:tcW w:type="dxa" w:w="2160"/>
+            <w:tcMar>
+              <w:top w:type="dxa" w:w="60"/>
+              <w:left w:type="dxa" w:w="90"/>
+              <w:bottom w:type="dxa" w:w="60"/>
+              <w:right w:type="dxa" w:w="90"/>
+            </w:tcMar>
+          </w:tcPr>
+          <w:p>
+            <w:pPr>
+              <w:spacing w:after="40"/>
+            </w:pPr>
+            <w:r>
+              <w:rPr>
+                <w:b w:val="false"/>
+                <w:bCs w:val="false"/>
+                <w:sz w:val="17"/>
+                <w:szCs w:val="17"/>
+              </w:rPr>
+              <w:t xml:space="preserve">Book link: p.46 C "Think and discuss. Design the next type of money." Frame: "I think the next type of money will be …".</w:t>
+            </w:r>
+          </w:p>
+          <w:p>
+            <w:pPr>
+              <w:spacing w:after="40"/>
+            </w:pPr>
+            <w:r>
+              <w:rPr>
+                <w:b w:val="false"/>
+                <w:bCs w:val="false"/>
+                <w:sz w:val="17"/>
+                <w:szCs w:val="17"/>
+              </w:rPr>
+              <w:t xml:space="preserve">Press Spin for ideas (a pupil may use it or ignore it). Start the timer for drawing. Then pupils show their design and say the frame. Press "A pupil shared!" for each design.</w:t>
+            </w:r>
+          </w:p>
+          <w:p>
+            <w:pPr>
+              <w:spacing w:after="40"/>
+            </w:pPr>
+            <w:r>
+              <w:rPr>
+                <w:b w:val="false"/>
+                <w:bCs w:val="false"/>
+                <w:sz w:val="17"/>
+                <w:szCs w:val="17"/>
+              </w:rPr>
+              <w:t xml:space="preserve">Stick the best designs on the wall as the class "Money of the Future".</w:t>
+            </w:r>
+          </w:p>
+        </w:tc>
+      </w:tr>
+      <w:tr>
+        <w:trPr>
+          <w:cantSplit/>
+        </w:trPr>
+        <w:tc>
+          <w:tcPr>
+            <w:tcW w:type="dxa" w:w="500"/>
+            <w:tcMar>
+              <w:top w:type="dxa" w:w="60"/>
+              <w:left w:type="dxa" w:w="90"/>
+              <w:bottom w:type="dxa" w:w="60"/>
+              <w:right w:type="dxa" w:w="90"/>
+            </w:tcMar>
+          </w:tcPr>
+          <w:p>
+            <w:pPr>
+              <w:spacing w:after="40"/>
+            </w:pPr>
+            <w:r>
+              <w:rPr>
+                <w:b w:val="false"/>
+                <w:bCs w:val="false"/>
+                <w:sz w:val="20"/>
+                <w:szCs w:val="20"/>
+              </w:rPr>
+              <w:t xml:space="preserve">6</w:t>
+            </w:r>
+          </w:p>
+        </w:tc>
+        <w:tc>
+          <w:tcPr>
+            <w:tcW w:type="dxa" w:w="1900"/>
+            <w:tcMar>
+              <w:top w:type="dxa" w:w="60"/>
+              <w:left w:type="dxa" w:w="90"/>
+              <w:bottom w:type="dxa" w:w="60"/>
+              <w:right w:type="dxa" w:w="90"/>
+            </w:tcMar>
+          </w:tcPr>
+          <w:p>
+            <w:pPr>
+              <w:spacing w:after="40"/>
+            </w:pPr>
+            <w:r>
+              <w:rPr>
+                <w:b/>
+                <w:bCs/>
+                <w:sz w:val="20"/>
+                <w:szCs w:val="20"/>
+              </w:rPr>
+              <w:t xml:space="preserve">Money Designers’ Ceremony</w:t>
+            </w:r>
+          </w:p>
+        </w:tc>
+        <w:tc>
+          <w:tcPr>
+            <w:tcW w:type="dxa" w:w="800"/>
+            <w:tcMar>
+              <w:top w:type="dxa" w:w="60"/>
+              <w:left w:type="dxa" w:w="90"/>
+              <w:bottom w:type="dxa" w:w="60"/>
+              <w:right w:type="dxa" w:w="90"/>
+            </w:tcMar>
+          </w:tcPr>
+          <w:p>
+            <w:pPr>
+              <w:spacing w:after="40"/>
+            </w:pPr>
+            <w:r>
+              <w:rPr>
+                <w:b w:val="false"/>
+                <w:bCs w:val="false"/>
+                <w:sz w:val="20"/>
+                <w:szCs w:val="20"/>
+              </w:rPr>
+              <w:t xml:space="preserve">3 min</w:t>
+            </w:r>
+          </w:p>
+        </w:tc>
+        <w:tc>
+          <w:tcPr>
+            <w:tcW w:type="dxa" w:w="1100"/>
+            <w:tcMar>
+              <w:top w:type="dxa" w:w="60"/>
+              <w:left w:type="dxa" w:w="90"/>
+              <w:bottom w:type="dxa" w:w="60"/>
+              <w:right w:type="dxa" w:w="90"/>
+            </w:tcMar>
+          </w:tcPr>
+          <w:p>
+            <w:pPr>
+              <w:spacing w:after="40"/>
+            </w:pPr>
+            <w:r>
+              <w:rPr>
+                <w:b w:val="false"/>
+                <w:bCs w:val="false"/>
+                <w:sz w:val="20"/>
+                <w:szCs w:val="20"/>
+              </w:rPr>
+              <w:t xml:space="preserve">Think</w:t>
+            </w:r>
+          </w:p>
+        </w:tc>
+        <w:tc>
+          <w:tcPr>
+            <w:tcW w:type="dxa" w:w="2900"/>
+            <w:tcMar>
+              <w:top w:type="dxa" w:w="60"/>
+              <w:left w:type="dxa" w:w="90"/>
+              <w:bottom w:type="dxa" w:w="60"/>
+              <w:right w:type="dxa" w:w="90"/>
+            </w:tcMar>
+          </w:tcPr>
+          <w:p>
+            <w:pPr>
+              <w:spacing w:after="40"/>
+            </w:pPr>
+            <w:r>
+              <w:rPr>
+                <w:b w:val="false"/>
+                <w:bCs w:val="false"/>
+                <w:sz w:val="18"/>
+                <w:szCs w:val="18"/>
+              </w:rPr>
+              <w:t xml:space="preserve">• Cheer for every team</w:t>
+            </w:r>
+          </w:p>
+          <w:p>
+            <w:pPr>
+              <w:spacing w:after="40"/>
+            </w:pPr>
+            <w:r>
+              <w:rPr>
+                <w:b w:val="false"/>
+                <w:bCs w:val="false"/>
+                <w:sz w:val="18"/>
+                <w:szCs w:val="18"/>
+              </w:rPr>
+              <w:t xml:space="preserve">• Door pass: show your design and say one sentence</w:t>
+            </w:r>
+          </w:p>
+          <w:p>
+            <w:pPr>
+              <w:spacing w:after="40"/>
+            </w:pPr>
+            <w:r>
+              <w:rPr>
+                <w:b w:val="false"/>
+                <w:bCs w:val="false"/>
+                <w:sz w:val="18"/>
+                <w:szCs w:val="18"/>
+              </w:rPr>
+              <w:t xml:space="preserve">Say: I think the next type of money will be …</w:t>
+            </w:r>
+          </w:p>
+        </w:tc>
+        <w:tc>
+          <w:tcPr>
+            <w:tcW w:type="dxa" w:w="2160"/>
+            <w:tcMar>
+              <w:top w:type="dxa" w:w="60"/>
+              <w:left w:type="dxa" w:w="90"/>
+              <w:bottom w:type="dxa" w:w="60"/>
+              <w:right w:type="dxa" w:w="90"/>
+            </w:tcMar>
+          </w:tcPr>
+          <w:p>
+            <w:pPr>
+              <w:spacing w:after="40"/>
+            </w:pPr>
+            <w:r>
+              <w:rPr>
+                <w:b w:val="false"/>
+                <w:bCs w:val="false"/>
+                <w:sz w:val="17"/>
+                <w:szCs w:val="17"/>
+              </w:rPr>
+              <w:t xml:space="preserve">At the door each pupil shows the design and says "I think the next type of money will be a …". Next lessons: Reading 2, The $100 Bill (pp.48-55).</w:t>
+            </w:r>
+          </w:p>
+        </w:tc>
+      </w:tr>
+    </w:tbl>
+    <w:p>
+      <w:pPr>
+        <w:spacing w:before="140"/>
+      </w:pPr>
+    </w:p>
+    <w:p>
+      <w:pPr>
+        <w:spacing w:after="60"/>
+      </w:pPr>
+      <w:r>
+        <w:rPr>
+          <w:b/>
+          <w:bCs/>
+        </w:rPr>
+        <w:t xml:space="preserve">Support. </w:t>
+      </w:r>
+      <w:r>
+        <w:t xml:space="preserve">Fill the chart from the picture cards; use the Money Machine words for the design; partner draws, you say.</w:t>
+      </w:r>
+    </w:p>
+    <w:p>
+      <w:pPr>
+        <w:spacing w:after="60"/>
+      </w:pPr>
+      <w:r>
+        <w:rPr>
+          <w:b/>
+          <w:bCs/>
+        </w:rPr>
+        <w:t xml:space="preserve">Stretch. </w:t>
+      </w:r>
+      <w:r>
+        <w:t xml:space="preserve">Explain the problem of the old money and how the next money solves it; write the design sentence in the notebook.</w:t>
+      </w:r>
+    </w:p>
+    <w:p>
+      <w:pPr>
+        <w:spacing w:after="60"/>
+      </w:pPr>
+      <w:r>
+        <w:rPr>
+          <w:b/>
+          <w:bCs/>
+        </w:rPr>
+        <w:t xml:space="preserve">Check learning. </w:t>
+      </w:r>
+      <w:r>
+        <w:t xml:space="preserve">Door pass: show your design and say one sentence about it. Give a team point for every correct team, not only the fastest.</w:t>
       </w:r>
     </w:p>
     <w:p>

</xml_diff>

<commit_message>
feat: Unit 3 games for Grades 3 and 4 (Alley Fling cats vs dogs, Bamboozle, Mountain Race, Arcade, new Shop Counter), Lesson 5 library card and plan, games guide
Co-Authored-By: Claude Sonnet 5.5 <noreply@anthropic.com>
</commit_message>
<xml_diff>
--- a/lesson-plans/Grade3-Unit3-Lesson-Plans.docx
+++ b/lesson-plans/Grade3-Unit3-Lesson-Plans.docx
@@ -7211,41 +7211,8 @@
 </w:document>
 </file>
 
-<file path=word/endnotes.xml><?xml version="1.0" encoding="utf-8"?>
-<w:endnotes xmlns:wpc="http://schemas.microsoft.com/office/word/2010/wordprocessingCanvas" xmlns:mc="http://schemas.openxmlformats.org/markup-compatibility/2006" xmlns:o="urn:schemas-microsoft-com:office:office" xmlns:r="http://schemas.openxmlformats.org/officeDocument/2006/relationships" xmlns:m="http://schemas.openxmlformats.org/officeDocument/2006/math" xmlns:v="urn:schemas-microsoft-com:vml" xmlns:wp14="http://schemas.microsoft.com/office/word/2010/wordprocessingDrawing" xmlns:wp="http://schemas.openxmlformats.org/drawingml/2006/wordprocessingDrawing" xmlns:w10="urn:schemas-microsoft-com:office:word" xmlns:w="http://schemas.openxmlformats.org/wordprocessingml/2006/main" xmlns:w14="http://schemas.microsoft.com/office/word/2010/wordml" xmlns:w15="http://schemas.microsoft.com/office/word/2012/wordml" xmlns:wpg="http://schemas.microsoft.com/office/word/2010/wordprocessingGroup" xmlns:wpi="http://schemas.microsoft.com/office/word/2010/wordprocessingInk" xmlns:wne="http://schemas.microsoft.com/office/word/2006/wordml" xmlns:wps="http://schemas.microsoft.com/office/word/2010/wordprocessingShape" mc:Ignorable="w14 w15 wp14">
-  <w:endnote w:type="separator" w:id="-1">
-    <w:p>
-      <w:pPr>
-        <w:spacing w:after="0" w:line="240" w:lineRule="auto"/>
-      </w:pPr>
-      <w:r>
-        <w:rPr>
-          <w:rStyle w:val="EndnoteReference"/>
-        </w:rPr>
-        <w:endnoteRef/>
-      </w:r>
-      <w:r>
-        <w:separator/>
-      </w:r>
-    </w:p>
-  </w:endnote>
-  <w:endnote w:type="continuationSeparator" w:id="0">
-    <w:p>
-      <w:pPr>
-        <w:spacing w:after="0" w:line="240" w:lineRule="auto"/>
-      </w:pPr>
-      <w:r>
-        <w:rPr>
-          <w:rStyle w:val="EndnoteReference"/>
-        </w:rPr>
-        <w:endnoteRef/>
-      </w:r>
-      <w:r>
-        <w:continuationSeparator/>
-      </w:r>
-    </w:p>
-  </w:endnote>
-</w:endnotes>
+<file path=word/comments.xml><?xml version="1.0" encoding="utf-8"?>
+<w:comments xmlns:cx="http://schemas.microsoft.com/office/drawing/2014/chartex" xmlns:cx1="http://schemas.microsoft.com/office/drawing/2015/9/8/chartex" xmlns:cx2="http://schemas.microsoft.com/office/drawing/2015/10/21/chartex" xmlns:cx3="http://schemas.microsoft.com/office/drawing/2016/5/9/chartex" xmlns:cx4="http://schemas.microsoft.com/office/drawing/2016/5/10/chartex" xmlns:cx5="http://schemas.microsoft.com/office/drawing/2016/5/11/chartex" xmlns:cx6="http://schemas.microsoft.com/office/drawing/2016/5/12/chartex" xmlns:cx7="http://schemas.microsoft.com/office/drawing/2016/5/13/chartex" xmlns:cx8="http://schemas.microsoft.com/office/drawing/2016/5/14/chartex" xmlns:mc="http://schemas.openxmlformats.org/markup-compatibility/2006" xmlns:aink="http://schemas.microsoft.com/office/drawing/2016/ink" xmlns:am3d="http://schemas.microsoft.com/office/drawing/2017/model3d" xmlns:o="urn:schemas-microsoft-com:office:office" xmlns:r="http://schemas.openxmlformats.org/officeDocument/2006/relationships" xmlns:m="http://schemas.openxmlformats.org/officeDocument/2006/math" xmlns:v="urn:schemas-microsoft-com:vml" xmlns:wp14="http://schemas.microsoft.com/office/word/2010/wordprocessingDrawing" xmlns:wp="http://schemas.openxmlformats.org/drawingml/2006/wordprocessingDrawing" xmlns:w10="urn:schemas-microsoft-com:office:word" xmlns:w="http://schemas.openxmlformats.org/wordprocessingml/2006/main" xmlns:w14="http://schemas.microsoft.com/office/word/2010/wordml" xmlns:w15="http://schemas.microsoft.com/office/word/2012/wordml" xmlns:w16cex="http://schemas.microsoft.com/office/word/2018/wordml/cex" xmlns:w16cid="http://schemas.microsoft.com/office/word/2016/wordml/cid" xmlns:w16="http://schemas.microsoft.com/office/word/2018/wordml" xmlns:w16sdtdh="http://schemas.microsoft.com/office/word/2020/wordml/sdtdatahash" xmlns:w16se="http://schemas.microsoft.com/office/word/2015/wordml/symex" xmlns:wpg="http://schemas.microsoft.com/office/word/2010/wordprocessingGroup" xmlns:wpi="http://schemas.microsoft.com/office/word/2010/wordprocessingInk" xmlns:wne="http://schemas.microsoft.com/office/word/2006/wordml" xmlns:wps="http://schemas.microsoft.com/office/word/2010/wordprocessingShape"/>
 </file>
 
 <file path=word/footnotes.xml><?xml version="1.0" encoding="utf-8"?>
@@ -7289,7 +7256,7 @@
 <w:numbering xmlns:wpc="http://schemas.microsoft.com/office/word/2010/wordprocessingCanvas" xmlns:mc="http://schemas.openxmlformats.org/markup-compatibility/2006" xmlns:o="urn:schemas-microsoft-com:office:office" xmlns:r="http://schemas.openxmlformats.org/officeDocument/2006/relationships" xmlns:m="http://schemas.openxmlformats.org/officeDocument/2006/math" xmlns:v="urn:schemas-microsoft-com:vml" xmlns:wp14="http://schemas.microsoft.com/office/word/2010/wordprocessingDrawing" xmlns:wp="http://schemas.openxmlformats.org/drawingml/2006/wordprocessingDrawing" xmlns:w10="urn:schemas-microsoft-com:office:word" xmlns:w="http://schemas.openxmlformats.org/wordprocessingml/2006/main" xmlns:w14="http://schemas.microsoft.com/office/word/2010/wordml" xmlns:w15="http://schemas.microsoft.com/office/word/2012/wordml" xmlns:wpg="http://schemas.microsoft.com/office/word/2010/wordprocessingGroup" xmlns:wpi="http://schemas.microsoft.com/office/word/2010/wordprocessingInk" xmlns:wne="http://schemas.microsoft.com/office/word/2006/wordml" xmlns:wps="http://schemas.microsoft.com/office/word/2010/wordprocessingShape" mc:Ignorable="w14 w15 wp14">
   <w:abstractNum w:abstractNumId="1" w15:restartNumberingAfterBreak="0">
     <w:multiLevelType w:val="hybridMultilevel"/>
-    <w:lvl w:ilvl="0" w:tentative="1">
+    <w:lvl w:ilvl="0" w15:tentative="1">
       <w:start w:val="1"/>
       <w:numFmt w:val="bullet"/>
       <w:lvlText w:val="●"/>
@@ -7298,7 +7265,7 @@
         <w:ind w:left="720" w:hanging="360"/>
       </w:pPr>
     </w:lvl>
-    <w:lvl w:ilvl="1" w:tentative="1">
+    <w:lvl w:ilvl="1" w15:tentative="1">
       <w:start w:val="1"/>
       <w:numFmt w:val="bullet"/>
       <w:lvlText w:val="○"/>
@@ -7307,7 +7274,7 @@
         <w:ind w:left="1440" w:hanging="360"/>
       </w:pPr>
     </w:lvl>
-    <w:lvl w:ilvl="2" w:tentative="1">
+    <w:lvl w:ilvl="2" w15:tentative="1">
       <w:start w:val="1"/>
       <w:numFmt w:val="bullet"/>
       <w:lvlText w:val="■"/>
@@ -7316,7 +7283,7 @@
         <w:ind w:left="2160" w:hanging="360"/>
       </w:pPr>
     </w:lvl>
-    <w:lvl w:ilvl="3" w:tentative="1">
+    <w:lvl w:ilvl="3" w15:tentative="1">
       <w:start w:val="1"/>
       <w:numFmt w:val="bullet"/>
       <w:lvlText w:val="●"/>
@@ -7325,7 +7292,7 @@
         <w:ind w:left="2880" w:hanging="360"/>
       </w:pPr>
     </w:lvl>
-    <w:lvl w:ilvl="4" w:tentative="1">
+    <w:lvl w:ilvl="4" w15:tentative="1">
       <w:start w:val="1"/>
       <w:numFmt w:val="bullet"/>
       <w:lvlText w:val="○"/>
@@ -7334,7 +7301,7 @@
         <w:ind w:left="3600" w:hanging="360"/>
       </w:pPr>
     </w:lvl>
-    <w:lvl w:ilvl="5" w:tentative="1">
+    <w:lvl w:ilvl="5" w15:tentative="1">
       <w:start w:val="1"/>
       <w:numFmt w:val="bullet"/>
       <w:lvlText w:val="■"/>
@@ -7343,7 +7310,7 @@
         <w:ind w:left="4320" w:hanging="360"/>
       </w:pPr>
     </w:lvl>
-    <w:lvl w:ilvl="6" w:tentative="1">
+    <w:lvl w:ilvl="6" w15:tentative="1">
       <w:start w:val="1"/>
       <w:numFmt w:val="bullet"/>
       <w:lvlText w:val="●"/>
@@ -7352,7 +7319,7 @@
         <w:ind w:left="5040" w:hanging="360"/>
       </w:pPr>
     </w:lvl>
-    <w:lvl w:ilvl="7" w:tentative="1">
+    <w:lvl w:ilvl="7" w15:tentative="1">
       <w:start w:val="1"/>
       <w:numFmt w:val="bullet"/>
       <w:lvlText w:val="●"/>
@@ -7361,7 +7328,7 @@
         <w:ind w:left="5760" w:hanging="360"/>
       </w:pPr>
     </w:lvl>
-    <w:lvl w:ilvl="8" w:tentative="1">
+    <w:lvl w:ilvl="8" w15:tentative="1">
       <w:start w:val="1"/>
       <w:numFmt w:val="bullet"/>
       <w:lvlText w:val="●"/>
@@ -7385,17 +7352,13 @@
   <w:docDefaults>
     <w:rPrDefault>
       <w:rPr>
-        <w:rFonts w:ascii="Calibri" w:cs="Calibri" w:eastAsia="Calibri" w:hAnsi="Calibri"/>
         <w:sz w:val="21"/>
         <w:szCs w:val="21"/>
+        <w:rFonts w:ascii="Calibri" w:cs="Calibri" w:eastAsia="Calibri" w:hAnsi="Calibri"/>
       </w:rPr>
     </w:rPrDefault>
     <w:pPrDefault/>
   </w:docDefaults>
-  <w:style w:type="paragraph" w:styleId="Normal" w:default="1">
-    <w:name w:val="Normal"/>
-    <w:qFormat/>
-  </w:style>
   <w:style w:type="paragraph" w:styleId="Title">
     <w:name w:val="Title"/>
     <w:basedOn w:val="Normal"/>
@@ -7404,6 +7367,17 @@
     <w:rPr>
       <w:sz w:val="56"/>
       <w:szCs w:val="56"/>
+    </w:rPr>
+  </w:style>
+  <w:style w:type="paragraph" w:styleId="Heading1">
+    <w:name w:val="Heading 1"/>
+    <w:basedOn w:val="Normal"/>
+    <w:next w:val="Normal"/>
+    <w:qFormat/>
+    <w:rPr>
+      <w:color w:val="2E74B5"/>
+      <w:sz w:val="32"/>
+      <w:szCs w:val="32"/>
     </w:rPr>
   </w:style>
   <w:style w:type="paragraph" w:styleId="Heading2">
@@ -7478,8 +7452,8 @@
     <w:uiPriority w:val="99"/>
     <w:unhideWhenUsed/>
     <w:rPr>
+      <w:u w:val="single"/>
       <w:color w:val="0563C1"/>
-      <w:u w:val="single"/>
     </w:rPr>
   </w:style>
   <w:style w:type="character" w:styleId="FootnoteReference">
@@ -7519,50 +7493,13 @@
       <w:szCs w:val="20"/>
     </w:rPr>
   </w:style>
-  <w:style w:type="character" w:styleId="EndnoteReference">
-    <w:name w:val="endnote reference"/>
-    <w:basedOn w:val="DefaultParagraphFont"/>
-    <w:uiPriority w:val="99"/>
-    <w:semiHidden/>
-    <w:unhideWhenUsed/>
-    <w:rPr>
-      <w:vertAlign w:val="superscript"/>
-    </w:rPr>
-  </w:style>
-  <w:style w:type="paragraph" w:styleId="EndnoteText">
-    <w:name w:val="endnote text"/>
-    <w:basedOn w:val="Normal"/>
-    <w:link w:val="EndnoteTextChar"/>
-    <w:uiPriority w:val="99"/>
-    <w:semiHidden/>
-    <w:unhideWhenUsed/>
-    <w:pPr>
-      <w:spacing w:after="0" w:line="240" w:lineRule="auto"/>
-    </w:pPr>
-    <w:rPr>
-      <w:sz w:val="20"/>
-      <w:szCs w:val="20"/>
-    </w:rPr>
-  </w:style>
-  <w:style w:type="character" w:styleId="EndnoteTextChar">
-    <w:name w:val="Endnote Text Char"/>
-    <w:basedOn w:val="DefaultParagraphFont"/>
-    <w:link w:val="EndnoteText"/>
-    <w:uiPriority w:val="99"/>
-    <w:semiHidden/>
-    <w:unhideWhenUsed/>
-    <w:rPr>
-      <w:sz w:val="20"/>
-      <w:szCs w:val="20"/>
-    </w:rPr>
-  </w:style>
   <w:style w:type="paragraph" w:styleId="Heading1">
     <w:name w:val="Heading 1"/>
     <w:basedOn w:val="Normal"/>
     <w:next w:val="Normal"/>
     <w:qFormat/>
     <w:pPr>
-      <w:spacing w:after="120" w:before="120"/>
+      <w:spacing w:before="120" w:after="120"/>
       <w:outlineLvl w:val="0"/>
     </w:pPr>
     <w:rPr>
@@ -7574,294 +7511,4 @@
     </w:rPr>
   </w:style>
 </w:styles>
-</file>
-
-<file path=word/theme/theme1.xml><?xml version="1.0" encoding="utf-8"?>
-<a:theme xmlns:a="http://schemas.openxmlformats.org/drawingml/2006/main" name="Office Theme">
-  <a:themeElements>
-    <a:clrScheme name="Office">
-      <a:dk1>
-        <a:sysClr val="windowText" lastClr="000000"/>
-      </a:dk1>
-      <a:lt1>
-        <a:sysClr val="window" lastClr="FFFFFF"/>
-      </a:lt1>
-      <a:dk2>
-        <a:srgbClr val="44546A"/>
-      </a:dk2>
-      <a:lt2>
-        <a:srgbClr val="E7E6E6"/>
-      </a:lt2>
-      <a:accent1>
-        <a:srgbClr val="4472C4"/>
-      </a:accent1>
-      <a:accent2>
-        <a:srgbClr val="ED7D31"/>
-      </a:accent2>
-      <a:accent3>
-        <a:srgbClr val="A5A5A5"/>
-      </a:accent3>
-      <a:accent4>
-        <a:srgbClr val="FFC000"/>
-      </a:accent4>
-      <a:accent5>
-        <a:srgbClr val="5B9BD5"/>
-      </a:accent5>
-      <a:accent6>
-        <a:srgbClr val="70AD47"/>
-      </a:accent6>
-      <a:hlink>
-        <a:srgbClr val="0563C1"/>
-      </a:hlink>
-      <a:folHlink>
-        <a:srgbClr val="954F72"/>
-      </a:folHlink>
-    </a:clrScheme>
-    <a:fontScheme name="Office">
-      <a:majorFont>
-        <a:latin typeface="Calibri Light" panose="020F0302020204030204"/>
-        <a:ea typeface=""/>
-        <a:cs typeface=""/>
-        <a:font script="Jpan" typeface="游ゴシック Light"/>
-        <a:font script="Hang" typeface="맑은 고딕"/>
-        <a:font script="Hans" typeface="等线 Light"/>
-        <a:font script="Hant" typeface="新細明體"/>
-        <a:font script="Arab" typeface="Times New Roman"/>
-        <a:font script="Hebr" typeface="Times New Roman"/>
-        <a:font script="Thai" typeface="Angsana New"/>
-        <a:font script="Ethi" typeface="Nyala"/>
-        <a:font script="Beng" typeface="Vrinda"/>
-        <a:font script="Gujr" typeface="Shruti"/>
-        <a:font script="Khmr" typeface="MoolBoran"/>
-        <a:font script="Knda" typeface="Tunga"/>
-        <a:font script="Guru" typeface="Raavi"/>
-        <a:font script="Cans" typeface="Euphemia"/>
-        <a:font script="Cher" typeface="Plantagenet Cherokee"/>
-        <a:font script="Yiii" typeface="Microsoft Yi Baiti"/>
-        <a:font script="Tibt" typeface="Microsoft Himalaya"/>
-        <a:font script="Thaa" typeface="MV Boli"/>
-        <a:font script="Deva" typeface="Mangal"/>
-        <a:font script="Telu" typeface="Gautami"/>
-        <a:font script="Taml" typeface="Latha"/>
-        <a:font script="Syrc" typeface="Estrangelo Edessa"/>
-        <a:font script="Orya" typeface="Kalinga"/>
-        <a:font script="Mlym" typeface="Kartika"/>
-        <a:font script="Laoo" typeface="DokChampa"/>
-        <a:font script="Sinh" typeface="Iskoola Pota"/>
-        <a:font script="Mong" typeface="Mongolian Baiti"/>
-        <a:font script="Viet" typeface="Times New Roman"/>
-        <a:font script="Uigh" typeface="Microsoft Uighur"/>
-        <a:font script="Geor" typeface="Sylfaen"/>
-        <a:font script="Armn" typeface="Arial"/>
-        <a:font script="Bugi" typeface="Leelawadee UI"/>
-        <a:font script="Bopo" typeface="Microsoft JhengHei"/>
-        <a:font script="Java" typeface="Javanese Text"/>
-        <a:font script="Lisu" typeface="Segoe UI"/>
-        <a:font script="Mymr" typeface="Myanmar Text"/>
-        <a:font script="Nkoo" typeface="Ebrima"/>
-        <a:font script="Olck" typeface="Nirmala UI"/>
-        <a:font script="Osma" typeface="Ebrima"/>
-        <a:font script="Phag" typeface="Phagspa"/>
-        <a:font script="Syrn" typeface="Estrangelo Edessa"/>
-        <a:font script="Syrj" typeface="Estrangelo Edessa"/>
-        <a:font script="Syre" typeface="Estrangelo Edessa"/>
-        <a:font script="Sora" typeface="Nirmala UI"/>
-        <a:font script="Tale" typeface="Microsoft Tai Le"/>
-        <a:font script="Talu" typeface="Microsoft New Tai Lue"/>
-        <a:font script="Tfng" typeface="Ebrima"/>
-      </a:majorFont>
-      <a:minorFont>
-        <a:latin typeface="Calibri" panose="020F0502020204030204"/>
-        <a:ea typeface=""/>
-        <a:cs typeface=""/>
-        <a:font script="Jpan" typeface="游明朝"/>
-        <a:font script="Hang" typeface="맑은 고딕"/>
-        <a:font script="Hans" typeface="等线"/>
-        <a:font script="Hant" typeface="新細明體"/>
-        <a:font script="Arab" typeface="Arial"/>
-        <a:font script="Hebr" typeface="Arial"/>
-        <a:font script="Thai" typeface="Cordia New"/>
-        <a:font script="Ethi" typeface="Nyala"/>
-        <a:font script="Beng" typeface="Vrinda"/>
-        <a:font script="Gujr" typeface="Shruti"/>
-        <a:font script="Khmr" typeface="DaunPenh"/>
-        <a:font script="Knda" typeface="Tunga"/>
-        <a:font script="Guru" typeface="Raavi"/>
-        <a:font script="Cans" typeface="Euphemia"/>
-        <a:font script="Cher" typeface="Plantagenet Cherokee"/>
-        <a:font script="Yiii" typeface="Microsoft Yi Baiti"/>
-        <a:font script="Tibt" typeface="Microsoft Himalaya"/>
-        <a:font script="Thaa" typeface="MV Boli"/>
-        <a:font script="Deva" typeface="Mangal"/>
-        <a:font script="Telu" typeface="Gautami"/>
-        <a:font script="Taml" typeface="Latha"/>
-        <a:font script="Syrc" typeface="Estrangelo Edessa"/>
-        <a:font script="Orya" typeface="Kalinga"/>
-        <a:font script="Mlym" typeface="Kartika"/>
-        <a:font script="Laoo" typeface="DokChampa"/>
-        <a:font script="Sinh" typeface="Iskoola Pota"/>
-        <a:font script="Mong" typeface="Mongolian Baiti"/>
-        <a:font script="Viet" typeface="Arial"/>
-        <a:font script="Uigh" typeface="Microsoft Uighur"/>
-        <a:font script="Geor" typeface="Sylfaen"/>
-        <a:font script="Armn" typeface="Arial"/>
-        <a:font script="Bugi" typeface="Leelawadee UI"/>
-        <a:font script="Bopo" typeface="Microsoft JhengHei"/>
-        <a:font script="Java" typeface="Javanese Text"/>
-        <a:font script="Lisu" typeface="Segoe UI"/>
-        <a:font script="Mymr" typeface="Myanmar Text"/>
-        <a:font script="Nkoo" typeface="Ebrima"/>
-        <a:font script="Olck" typeface="Nirmala UI"/>
-        <a:font script="Osma" typeface="Ebrima"/>
-        <a:font script="Phag" typeface="Phagspa"/>
-        <a:font script="Syrn" typeface="Estrangelo Edessa"/>
-        <a:font script="Syrj" typeface="Estrangelo Edessa"/>
-        <a:font script="Syre" typeface="Estrangelo Edessa"/>
-        <a:font script="Sora" typeface="Nirmala UI"/>
-        <a:font script="Tale" typeface="Microsoft Tai Le"/>
-        <a:font script="Talu" typeface="Microsoft New Tai Lue"/>
-        <a:font script="Tfng" typeface="Ebrima"/>
-      </a:minorFont>
-    </a:fontScheme>
-    <a:fmtScheme name="Office">
-      <a:fillStyleLst>
-        <a:solidFill>
-          <a:schemeClr val="phClr"/>
-        </a:solidFill>
-        <a:gradFill rotWithShape="true">
-          <a:gsLst>
-            <a:gs pos="0">
-              <a:schemeClr val="phClr">
-                <a:lumMod val="110000"/>
-                <a:satMod val="105000"/>
-                <a:tint val="67000"/>
-              </a:schemeClr>
-            </a:gs>
-            <a:gs pos="50000">
-              <a:schemeClr val="phClr">
-                <a:lumMod val="105000"/>
-                <a:satMod val="103000"/>
-                <a:tint val="73000"/>
-              </a:schemeClr>
-            </a:gs>
-            <a:gs pos="100000">
-              <a:schemeClr val="phClr">
-                <a:lumMod val="105000"/>
-                <a:satMod val="109000"/>
-                <a:tint val="81000"/>
-              </a:schemeClr>
-            </a:gs>
-          </a:gsLst>
-          <a:lin ang="5400000" scaled="false"/>
-        </a:gradFill>
-        <a:gradFill rotWithShape="true">
-          <a:gsLst>
-            <a:gs pos="0">
-              <a:schemeClr val="phClr">
-                <a:satMod val="103000"/>
-                <a:lumMod val="102000"/>
-                <a:tint val="94000"/>
-              </a:schemeClr>
-            </a:gs>
-            <a:gs pos="50000">
-              <a:schemeClr val="phClr">
-                <a:satMod val="110000"/>
-                <a:lumMod val="100000"/>
-                <a:shade val="100000"/>
-              </a:schemeClr>
-            </a:gs>
-            <a:gs pos="100000">
-              <a:schemeClr val="phClr">
-                <a:lumMod val="99000"/>
-                <a:satMod val="120000"/>
-                <a:shade val="78000"/>
-              </a:schemeClr>
-            </a:gs>
-          </a:gsLst>
-          <a:lin ang="5400000" scaled="false"/>
-        </a:gradFill>
-      </a:fillStyleLst>
-      <a:lnStyleLst>
-        <a:ln w="6350" cap="flat" cmpd="sng" algn="ctr">
-          <a:solidFill>
-            <a:schemeClr val="phClr"/>
-          </a:solidFill>
-          <a:prstDash val="solid"/>
-          <a:miter lim="800000"/>
-        </a:ln>
-        <a:ln w="12700" cap="flat" cmpd="sng" algn="ctr">
-          <a:solidFill>
-            <a:schemeClr val="phClr"/>
-          </a:solidFill>
-          <a:prstDash val="solid"/>
-          <a:miter lim="800000"/>
-        </a:ln>
-        <a:ln w="19050" cap="flat" cmpd="sng" algn="ctr">
-          <a:solidFill>
-            <a:schemeClr val="phClr"/>
-          </a:solidFill>
-          <a:prstDash val="solid"/>
-          <a:miter lim="800000"/>
-        </a:ln>
-      </a:lnStyleLst>
-      <a:effectStyleLst>
-        <a:effectStyle>
-          <a:effectLst/>
-        </a:effectStyle>
-        <a:effectStyle>
-          <a:effectLst/>
-        </a:effectStyle>
-        <a:effectStyle>
-          <a:effectLst>
-            <a:outerShdw blurRad="57150" dist="19050" dir="5400000" algn="ctr" rotWithShape="false">
-              <a:srgbClr val="000000">
-                <a:alpha val="63000"/>
-              </a:srgbClr>
-            </a:outerShdw>
-          </a:effectLst>
-        </a:effectStyle>
-      </a:effectStyleLst>
-      <a:bgFillStyleLst>
-        <a:solidFill>
-          <a:schemeClr val="phClr"/>
-        </a:solidFill>
-        <a:solidFill>
-          <a:schemeClr val="phClr">
-            <a:tint val="95000"/>
-            <a:satMod val="170000"/>
-          </a:schemeClr>
-        </a:solidFill>
-        <a:gradFill rotWithShape="true">
-          <a:gsLst>
-            <a:gs pos="0">
-              <a:schemeClr val="phClr">
-                <a:tint val="93000"/>
-                <a:satMod val="150000"/>
-                <a:shade val="98000"/>
-                <a:lumMod val="102000"/>
-              </a:schemeClr>
-            </a:gs>
-            <a:gs pos="50000">
-              <a:schemeClr val="phClr">
-                <a:tint val="98000"/>
-                <a:satMod val="130000"/>
-                <a:shade val="90000"/>
-                <a:lumMod val="103000"/>
-              </a:schemeClr>
-            </a:gs>
-            <a:gs pos="100000">
-              <a:schemeClr val="phClr">
-                <a:shade val="63000"/>
-                <a:satMod val="120000"/>
-              </a:schemeClr>
-            </a:gs>
-          </a:gsLst>
-          <a:lin ang="5400000" scaled="false"/>
-        </a:gradFill>
-      </a:bgFillStyleLst>
-    </a:fmtScheme>
-  </a:themeElements>
-  <a:objectDefaults/>
-  <a:extraClrSchemeLst/>
-</a:theme>
 </file>
</xml_diff>